<commit_message>
Simplify customer query examples into one step per line
</commit_message>
<xml_diff>
--- a/docs/customer_guide_fa.docx
+++ b/docs/customer_guide_fa.docx
@@ -103,7 +103,7 @@
           <w:rFonts w:ascii="DejaVu Sans Mono" w:hAnsi="DejaVu Sans Mono" w:cs="DejaVu Sans"/>
           <w:sz w:val="18"/>
         </w:rPr>
-        <w:t>(Query("customer_search")</w:t>
+        <w:t>query = Query("customer_search")</w:t>
       </w:r>
     </w:p>
     <w:p>
@@ -117,7 +117,7 @@
           <w:rFonts w:ascii="DejaVu Sans Mono" w:hAnsi="DejaVu Sans Mono" w:cs="DejaVu Sans"/>
           <w:sz w:val="18"/>
         </w:rPr>
-        <w:t xml:space="preserve"> .between("2026-01-01", "2026-01-07")</w:t>
+        <w:t>query.between("2026-01-01", "2026-01-07")</w:t>
       </w:r>
     </w:p>
     <w:p>
@@ -131,7 +131,7 @@
           <w:rFonts w:ascii="DejaVu Sans Mono" w:hAnsi="DejaVu Sans Mono" w:cs="DejaVu Sans"/>
           <w:sz w:val="18"/>
         </w:rPr>
-        <w:t xml:space="preserve"> .where((col("a") &gt; 10) &amp; col("b").startswith("asdasa"))</w:t>
+        <w:t>query.where((col("a") &gt; 10) &amp; col("b").startswith("asdasa"))</w:t>
       </w:r>
     </w:p>
     <w:p>
@@ -145,7 +145,7 @@
           <w:rFonts w:ascii="DejaVu Sans Mono" w:hAnsi="DejaVu Sans Mono" w:cs="DejaVu Sans"/>
           <w:sz w:val="18"/>
         </w:rPr>
-        <w:t xml:space="preserve"> .select("a", "b", "c")</w:t>
+        <w:t>query.select("a", "b", "c")</w:t>
       </w:r>
     </w:p>
     <w:p>
@@ -159,7 +159,7 @@
           <w:rFonts w:ascii="DejaVu Sans Mono" w:hAnsi="DejaVu Sans Mono" w:cs="DejaVu Sans"/>
           <w:sz w:val="18"/>
         </w:rPr>
-        <w:t xml:space="preserve"> .limit(1_000_000)</w:t>
+        <w:t>query.limit(1_000_000)</w:t>
       </w:r>
     </w:p>
     <w:p>
@@ -173,7 +173,7 @@
           <w:rFonts w:ascii="DejaVu Sans Mono" w:hAnsi="DejaVu Sans Mono" w:cs="DejaVu Sans"/>
           <w:sz w:val="18"/>
         </w:rPr>
-        <w:t xml:space="preserve"> .output_files(4)</w:t>
+        <w:t>query.output_files(4)</w:t>
       </w:r>
     </w:p>
     <w:p>
@@ -187,7 +187,7 @@
           <w:rFonts w:ascii="DejaVu Sans Mono" w:hAnsi="DejaVu Sans Mono" w:cs="DejaVu Sans"/>
           <w:sz w:val="18"/>
         </w:rPr>
-        <w:t xml:space="preserve"> .run())</w:t>
+        <w:t>query.run()</w:t>
       </w:r>
     </w:p>
     <w:p>

</xml_diff>

<commit_message>
Add column discovery and service owner and Persian customer guides
</commit_message>
<xml_diff>
--- a/docs/customer_guide_fa.docx
+++ b/docs/customer_guide_fa.docx
@@ -5,404 +5,1176 @@
     <w:p>
       <w:pPr>
         <w:pStyle w:val="Title"/>
-        <w:jc w:val="right"/>
         <w:keepLines/>
         <w:bidi w:val="1"/>
+        <w:jc w:val="right"/>
       </w:pPr>
       <w:r>
         <w:rPr>
-          <w:rFonts w:ascii="DejaVu Sans" w:hAnsi="DejaVu Sans" w:cs="DejaVu Sans"/>
-          <w:sz w:val="38"/>
+          <w:rFonts w:ascii="DejaVu Sans" w:hAnsi="DejaVu Sans" w:cs="DejaVu Sans" w:eastAsia="DejaVu Sans"/>
+          <w:b/>
+          <w:color w:val="000000"/>
+          <w:sz w:val="42"/>
           <w:rtl w:val="1"/>
         </w:rPr>
-        <w:t>راهنمای استخراج داده در دفترچه مشتری</w:t>
+        <w:t>راهنمای سادهٔ پیدا کردن ستون‌ها و گرفتن خروجی</w:t>
       </w:r>
     </w:p>
     <w:p>
       <w:pPr>
+        <w:keepLines w:val="0"/>
+        <w:bidi w:val="1"/>
         <w:jc w:val="right"/>
-        <w:keepLines/>
-        <w:bidi w:val="1"/>
       </w:pPr>
       <w:r>
         <w:rPr>
-          <w:rFonts w:ascii="DejaVu Sans" w:hAnsi="DejaVu Sans" w:cs="DejaVu Sans"/>
-          <w:sz w:val="22"/>
+          <w:rFonts w:ascii="DejaVu Sans" w:hAnsi="DejaVu Sans" w:cs="DejaVu Sans" w:eastAsia="DejaVu Sans"/>
+          <w:b w:val="0"/>
+          <w:color w:val="000000"/>
+          <w:sz w:val="21"/>
           <w:rtl w:val="1"/>
         </w:rPr>
-        <w:t>این راهنما برای اجرای جست‌وجو در دفترچه از پیش آماده‌شده و دریافت فایل‌های نتیجه است. مدیر سامانه اتصال و مسیرها را تنظیم می‌کند؛ شما فقط نام جست‌وجو، تاریخ‌ها، شرط‌ها، ستون‌ها و سقف خروجی را تغییر دهید.</w:t>
+        <w:t>این راهنما برای دفترچهٔ آماده‌ای است که مدیر سامانه در اختیار شما می‌گذارد. اتصال و مسیر داده را مدیر تنظیم می‌کند. شما تاریخ را وارد می‌کنید، نام ستون‌ها را می‌بینید، شرط و ستون‌های خروجی را انتخاب می‌کنید و نتیجه را می‌گیرید.</w:t>
       </w:r>
     </w:p>
     <w:p>
       <w:pPr>
         <w:pStyle w:val="Heading1"/>
-        <w:jc w:val="right"/>
         <w:keepLines/>
         <w:bidi w:val="1"/>
+        <w:jc w:val="right"/>
       </w:pPr>
       <w:r>
         <w:rPr>
-          <w:rFonts w:ascii="DejaVu Sans" w:hAnsi="DejaVu Sans" w:cs="DejaVu Sans"/>
-          <w:sz w:val="28"/>
+          <w:rFonts w:ascii="DejaVu Sans" w:hAnsi="DejaVu Sans" w:cs="DejaVu Sans" w:eastAsia="DejaVu Sans"/>
+          <w:b/>
+          <w:color w:val="000000"/>
+          <w:sz w:val="30"/>
           <w:rtl w:val="1"/>
         </w:rPr>
-        <w:t>نخستین اجرا</w:t>
+        <w:t>۱. دفترچه را آماده کنید</w:t>
       </w:r>
     </w:p>
     <w:p>
       <w:pPr>
+        <w:keepLines w:val="0"/>
+        <w:bidi w:val="1"/>
         <w:jc w:val="right"/>
-        <w:keepLines/>
-        <w:bidi w:val="1"/>
       </w:pPr>
       <w:r>
         <w:rPr>
-          <w:rFonts w:ascii="DejaVu Sans" w:hAnsi="DejaVu Sans" w:cs="DejaVu Sans"/>
-          <w:sz w:val="22"/>
+          <w:rFonts w:ascii="DejaVu Sans" w:hAnsi="DejaVu Sans" w:cs="DejaVu Sans" w:eastAsia="DejaVu Sans"/>
+          <w:b w:val="0"/>
+          <w:color w:val="000000"/>
+          <w:sz w:val="21"/>
           <w:rtl w:val="1"/>
         </w:rPr>
-        <w:t>دفترچه customer_example.ipynb را باز کنید. نام ستون‌های نمونه را با ستون‌های واقعی داده جایگزین کنید. سلول را با Shift+Enter اجرا کنید و تا پیام پایان منتظر بمانید. هر بار فقط یک جست‌وجو اجرا می‌شود. نام باید با حرف یا عدد انگلیسی شروع شود و فقط حرف، عدد، زیرخط یا خط تیره داشته باشد؛ حداکثر ۶۴ نویسه. همان نام در همان روز اجرای تهران قابل استفاده دوباره نیست.</w:t>
+        <w:t xml:space="preserve">دفترچهٔ </w:t>
+      </w:r>
+      <w:r>
+        <w:rPr>
+          <w:rFonts w:ascii="DejaVu Sans Mono" w:hAnsi="DejaVu Sans Mono" w:cs="DejaVu Sans Mono" w:eastAsia="DejaVu Sans Mono"/>
+          <w:color w:val="233142"/>
+          <w:sz w:val="19"/>
+        </w:rPr>
+        <w:t>customer_example.ipynb</w:t>
+      </w:r>
+      <w:r>
+        <w:rPr>
+          <w:rFonts w:ascii="DejaVu Sans" w:hAnsi="DejaVu Sans" w:cs="DejaVu Sans" w:eastAsia="DejaVu Sans"/>
+          <w:b w:val="0"/>
+          <w:color w:val="000000"/>
+          <w:sz w:val="21"/>
+          <w:rtl w:val="1"/>
+        </w:rPr>
+        <w:t xml:space="preserve"> را در محیطی که مدیر آماده کرده باز کنید. هستهٔ (Kernel) معرفی‌شده را انتخاب کنید و سلول‌ها را از بالا به پایین اجرا کنید. هستهٔ این دفترچه از اتصال Spark از راه شبکه استفاده می‌کند. اگر مدیر از شما خواست هسته را دوباره راه‌اندازی کنید، همین هسته را انتخاب کنید؛ نشانی اتصال را در دفترچه تغییر ندهید.</w:t>
+      </w:r>
+    </w:p>
+    <w:p>
+      <w:pPr>
+        <w:keepLines w:val="0"/>
+        <w:bidi w:val="1"/>
+        <w:jc w:val="right"/>
+      </w:pPr>
+      <w:r>
+        <w:rPr>
+          <w:rFonts w:ascii="DejaVu Sans" w:hAnsi="DejaVu Sans" w:cs="DejaVu Sans" w:eastAsia="DejaVu Sans"/>
+          <w:b w:val="0"/>
+          <w:color w:val="000000"/>
+          <w:sz w:val="21"/>
+          <w:rtl w:val="1"/>
+        </w:rPr>
+        <w:t xml:space="preserve">هر بار یک جست‌وجو اجرا کنید. نام باید با حرف یا عدد انگلیسی شروع شود، فقط حرف انگلیسی، عدد، زیرخط یا خط تیره داشته باشد و حداکثر ۶۴ نویسه باشد. برای اجرای خروجی، نامی تازه انتخاب کنید؛ همان نام در یک روز اجرای تهران دوباره قابل استفاده نیست. تاریخ‌ها با ارقام انگلیسی و قالب </w:t>
+      </w:r>
+      <w:r>
+        <w:rPr>
+          <w:rFonts w:ascii="DejaVu Sans Mono" w:hAnsi="DejaVu Sans Mono" w:cs="DejaVu Sans Mono" w:eastAsia="DejaVu Sans Mono"/>
+          <w:color w:val="233142"/>
+          <w:sz w:val="19"/>
+        </w:rPr>
+        <w:t>YYYY-MM-DD</w:t>
+      </w:r>
+      <w:r>
+        <w:rPr>
+          <w:rFonts w:ascii="DejaVu Sans" w:hAnsi="DejaVu Sans" w:cs="DejaVu Sans" w:eastAsia="DejaVu Sans"/>
+          <w:b w:val="0"/>
+          <w:color w:val="000000"/>
+          <w:sz w:val="21"/>
+          <w:rtl w:val="1"/>
+        </w:rPr>
+        <w:t xml:space="preserve"> نوشته می‌شوند. روز آغاز و پایان هر دو در بازه‌اند و بازه حداکثر هفت روز است. همهٔ روزهای بازه باید داده داشته باشند.</w:t>
+      </w:r>
+    </w:p>
+    <w:p>
+      <w:pPr>
+        <w:pStyle w:val="Heading1"/>
+        <w:keepLines/>
+        <w:bidi w:val="1"/>
+        <w:jc w:val="right"/>
+      </w:pPr>
+      <w:r>
+        <w:rPr>
+          <w:rFonts w:ascii="DejaVu Sans" w:hAnsi="DejaVu Sans" w:cs="DejaVu Sans" w:eastAsia="DejaVu Sans"/>
+          <w:b/>
+          <w:color w:val="000000"/>
+          <w:sz w:val="30"/>
+          <w:rtl w:val="1"/>
+        </w:rPr>
+        <w:t>۲. اول ستون‌ها و نوع آن‌ها را ببینید</w:t>
+      </w:r>
+    </w:p>
+    <w:p>
+      <w:pPr>
+        <w:keepLines w:val="0"/>
+        <w:bidi w:val="1"/>
+        <w:jc w:val="right"/>
+      </w:pPr>
+      <w:r>
+        <w:rPr>
+          <w:rFonts w:ascii="DejaVu Sans" w:hAnsi="DejaVu Sans" w:cs="DejaVu Sans" w:eastAsia="DejaVu Sans"/>
+          <w:b w:val="0"/>
+          <w:color w:val="000000"/>
+          <w:sz w:val="21"/>
+          <w:rtl w:val="1"/>
+        </w:rPr>
+        <w:t>نام جست‌وجوی دلخواه و تاریخ‌ها را وارد کنید و ابتدا این سلول را اجرا کنید. اگر این سلول را دوباره اجرا کنید، جست‌وجوی تازه‌ای ساخته می‌شود و شرط‌هایی که در شیء قبلی اضافه کرده بودید به آن منتقل نمی‌شوند.</w:t>
       </w:r>
     </w:p>
     <w:p>
       <w:pPr>
         <w:keepLines/>
-        <w:spacing w:after="40"/>
+        <w:bidi w:val="0"/>
+        <w:spacing w:after="120"/>
+        <w:ind w:left="360" w:right="360"/>
         <w:jc w:val="left"/>
       </w:pPr>
       <w:r>
         <w:rPr>
-          <w:rFonts w:ascii="DejaVu Sans Mono" w:hAnsi="DejaVu Sans Mono" w:cs="DejaVu Sans"/>
+          <w:rFonts w:ascii="DejaVu Sans Mono" w:hAnsi="DejaVu Sans Mono" w:cs="DejaVu Sans Mono" w:eastAsia="DejaVu Sans Mono"/>
+          <w:color w:val="233142"/>
           <w:sz w:val="18"/>
         </w:rPr>
-        <w:t>from pyspark.sql.functions import col</w:t>
+        <w:t>from data_extractor import Query</w:t>
+        <w:br/>
+        <w:br/>
+        <w:t>query = Query("customer_search")</w:t>
+        <w:br/>
+        <w:t>query.between("2026-01-01", "2026-01-07")</w:t>
+        <w:br/>
+        <w:t>columns = query.show_columns()</w:t>
+      </w:r>
+    </w:p>
+    <w:p>
+      <w:pPr>
+        <w:keepLines w:val="0"/>
+        <w:bidi w:val="1"/>
+        <w:jc w:val="right"/>
+      </w:pPr>
+      <w:r>
+        <w:rPr>
+          <w:rFonts w:ascii="DejaVu Sans" w:hAnsi="DejaVu Sans" w:cs="DejaVu Sans" w:eastAsia="DejaVu Sans"/>
+          <w:b w:val="0"/>
+          <w:color w:val="000000"/>
+          <w:sz w:val="21"/>
+          <w:rtl w:val="1"/>
+        </w:rPr>
+        <w:t xml:space="preserve">جدول فارسی چاپ‌شده، نام ستون‌های موجود و نوع هر ستون را نشان می‌دهد. </w:t>
+      </w:r>
+      <w:r>
+        <w:rPr>
+          <w:rFonts w:ascii="DejaVu Sans Mono" w:hAnsi="DejaVu Sans Mono" w:cs="DejaVu Sans Mono" w:eastAsia="DejaVu Sans Mono"/>
+          <w:color w:val="233142"/>
+          <w:sz w:val="19"/>
+        </w:rPr>
+        <w:t>show_columns()</w:t>
+      </w:r>
+      <w:r>
+        <w:rPr>
+          <w:rFonts w:ascii="DejaVu Sans" w:hAnsi="DejaVu Sans" w:cs="DejaVu Sans" w:eastAsia="DejaVu Sans"/>
+          <w:b w:val="0"/>
+          <w:color w:val="000000"/>
+          <w:sz w:val="21"/>
+          <w:rtl w:val="1"/>
+        </w:rPr>
+        <w:t xml:space="preserve"> اطلاعات طرح‌واره (schema) منبع ثابت مدیر را می‌خواند؛ خودش دادهٔ ردیف‌ها را جست‌وجو یا خروجی نمی‌گیرد. نوع‌ها را برای نوشتن شرط درست به کار ببرید: ستون عددی را با عدد، ستون متنی را با متن، و تاریخ را با مقدار مناسب همان نوع مقایسه کنید. مقادیر و نام‌های جدول زیر فقط نمونه‌اند و طرح‌وارهٔ واقعی محیط شما را نشان نمی‌دهند.</w:t>
+      </w:r>
+    </w:p>
+    <w:tbl>
+      <w:tblPr>
+        <w:tblStyle w:val="LightShading-Accent1"/>
+        <w:tblW w:type="auto" w:w="0"/>
+        <w:tblLayout w:type="autofit"/>
+        <w:tblLook w:firstColumn="1" w:firstRow="1" w:lastColumn="0" w:lastRow="0" w:noHBand="0" w:noVBand="1" w:val="04A0"/>
+      </w:tblPr>
+      <w:tblGrid>
+        <w:gridCol w:w="2613"/>
+        <w:gridCol w:w="2613"/>
+        <w:gridCol w:w="2613"/>
+        <w:gridCol w:w="2613"/>
+      </w:tblGrid>
+      <w:tr>
+        <w:tc>
+          <w:tcPr>
+            <w:tcW w:type="dxa" w:w="2613"/>
+            <w:vAlign w:val="center"/>
+            <w:textDirection w:val="rlTb"/>
+            <w:shd w:fill="DCEAF2"/>
+          </w:tcPr>
+          <w:p>
+            <w:pPr>
+              <w:bidi w:val="1"/>
+              <w:spacing w:after="60"/>
+              <w:jc w:val="right"/>
+            </w:pPr>
+            <w:r>
+              <w:rPr>
+                <w:rFonts w:ascii="DejaVu Sans" w:hAnsi="DejaVu Sans" w:cs="DejaVu Sans" w:eastAsia="DejaVu Sans"/>
+                <w:b/>
+                <w:color w:val="16354A"/>
+                <w:sz w:val="20"/>
+                <w:rtl w:val="1"/>
+              </w:rPr>
+              <w:t>نام نمونه</w:t>
+            </w:r>
+          </w:p>
+        </w:tc>
+        <w:tc>
+          <w:tcPr>
+            <w:tcW w:type="dxa" w:w="2613"/>
+            <w:vAlign w:val="center"/>
+            <w:textDirection w:val="rlTb"/>
+            <w:shd w:fill="DCEAF2"/>
+          </w:tcPr>
+          <w:p>
+            <w:pPr>
+              <w:bidi w:val="1"/>
+              <w:spacing w:after="60"/>
+              <w:jc w:val="right"/>
+            </w:pPr>
+            <w:r>
+              <w:rPr>
+                <w:rFonts w:ascii="DejaVu Sans" w:hAnsi="DejaVu Sans" w:cs="DejaVu Sans" w:eastAsia="DejaVu Sans"/>
+                <w:b/>
+                <w:color w:val="16354A"/>
+                <w:sz w:val="20"/>
+                <w:rtl w:val="1"/>
+              </w:rPr>
+              <w:t>نوع ساده</w:t>
+            </w:r>
+          </w:p>
+        </w:tc>
+        <w:tc>
+          <w:tcPr>
+            <w:tcW w:type="dxa" w:w="2613"/>
+            <w:vAlign w:val="center"/>
+            <w:textDirection w:val="rlTb"/>
+            <w:shd w:fill="DCEAF2"/>
+          </w:tcPr>
+          <w:p>
+            <w:pPr>
+              <w:bidi w:val="1"/>
+              <w:spacing w:after="60"/>
+              <w:jc w:val="right"/>
+            </w:pPr>
+            <w:r>
+              <w:rPr>
+                <w:rFonts w:ascii="DejaVu Sans" w:hAnsi="DejaVu Sans" w:cs="DejaVu Sans" w:eastAsia="DejaVu Sans"/>
+                <w:b/>
+                <w:color w:val="16354A"/>
+                <w:sz w:val="20"/>
+                <w:rtl w:val="1"/>
+              </w:rPr>
+              <w:t>تهی‌پذیر</w:t>
+            </w:r>
+          </w:p>
+        </w:tc>
+        <w:tc>
+          <w:tcPr>
+            <w:tcW w:type="dxa" w:w="2613"/>
+            <w:vAlign w:val="center"/>
+            <w:textDirection w:val="rlTb"/>
+            <w:shd w:fill="DCEAF2"/>
+          </w:tcPr>
+          <w:p>
+            <w:pPr>
+              <w:bidi w:val="1"/>
+              <w:spacing w:after="60"/>
+              <w:jc w:val="right"/>
+            </w:pPr>
+            <w:r>
+              <w:rPr>
+                <w:rFonts w:ascii="DejaVu Sans" w:hAnsi="DejaVu Sans" w:cs="DejaVu Sans" w:eastAsia="DejaVu Sans"/>
+                <w:b/>
+                <w:color w:val="16354A"/>
+                <w:sz w:val="20"/>
+                <w:rtl w:val="1"/>
+              </w:rPr>
+              <w:t>معنی نمونه</w:t>
+            </w:r>
+          </w:p>
+        </w:tc>
+      </w:tr>
+      <w:tr>
+        <w:tc>
+          <w:tcPr>
+            <w:tcW w:type="dxa" w:w="2613"/>
+            <w:vAlign w:val="center"/>
+            <w:textDirection w:val="rlTb"/>
+          </w:tcPr>
+          <w:p>
+            <w:pPr>
+              <w:bidi w:val="1"/>
+              <w:spacing w:after="60"/>
+              <w:jc w:val="right"/>
+            </w:pPr>
+            <w:r>
+              <w:rPr>
+                <w:rFonts w:ascii="DejaVu Sans" w:hAnsi="DejaVu Sans" w:cs="DejaVu Sans" w:eastAsia="DejaVu Sans"/>
+                <w:b w:val="0"/>
+                <w:color w:val="16354A"/>
+                <w:sz w:val="20"/>
+                <w:rtl w:val="1"/>
+              </w:rPr>
+              <w:t>customer_id</w:t>
+            </w:r>
+          </w:p>
+        </w:tc>
+        <w:tc>
+          <w:tcPr>
+            <w:tcW w:type="dxa" w:w="2613"/>
+            <w:vAlign w:val="center"/>
+            <w:textDirection w:val="rlTb"/>
+          </w:tcPr>
+          <w:p>
+            <w:pPr>
+              <w:bidi w:val="1"/>
+              <w:spacing w:after="60"/>
+              <w:jc w:val="right"/>
+            </w:pPr>
+            <w:r>
+              <w:rPr>
+                <w:rFonts w:ascii="DejaVu Sans" w:hAnsi="DejaVu Sans" w:cs="DejaVu Sans" w:eastAsia="DejaVu Sans"/>
+                <w:b w:val="0"/>
+                <w:color w:val="16354A"/>
+                <w:sz w:val="20"/>
+                <w:rtl w:val="1"/>
+              </w:rPr>
+              <w:t>عدد</w:t>
+            </w:r>
+          </w:p>
+        </w:tc>
+        <w:tc>
+          <w:tcPr>
+            <w:tcW w:type="dxa" w:w="2613"/>
+            <w:vAlign w:val="center"/>
+            <w:textDirection w:val="rlTb"/>
+          </w:tcPr>
+          <w:p>
+            <w:pPr>
+              <w:bidi w:val="1"/>
+              <w:spacing w:after="60"/>
+              <w:jc w:val="right"/>
+            </w:pPr>
+            <w:r>
+              <w:rPr>
+                <w:rFonts w:ascii="DejaVu Sans" w:hAnsi="DejaVu Sans" w:cs="DejaVu Sans" w:eastAsia="DejaVu Sans"/>
+                <w:b w:val="0"/>
+                <w:color w:val="16354A"/>
+                <w:sz w:val="20"/>
+                <w:rtl w:val="1"/>
+              </w:rPr>
+              <w:t>خیر</w:t>
+            </w:r>
+          </w:p>
+        </w:tc>
+        <w:tc>
+          <w:tcPr>
+            <w:tcW w:type="dxa" w:w="2613"/>
+            <w:vAlign w:val="center"/>
+            <w:textDirection w:val="rlTb"/>
+          </w:tcPr>
+          <w:p>
+            <w:pPr>
+              <w:bidi w:val="1"/>
+              <w:spacing w:after="60"/>
+              <w:jc w:val="right"/>
+            </w:pPr>
+            <w:r>
+              <w:rPr>
+                <w:rFonts w:ascii="DejaVu Sans" w:hAnsi="DejaVu Sans" w:cs="DejaVu Sans" w:eastAsia="DejaVu Sans"/>
+                <w:b w:val="0"/>
+                <w:color w:val="16354A"/>
+                <w:sz w:val="20"/>
+                <w:rtl w:val="1"/>
+              </w:rPr>
+              <w:t>شناسه</w:t>
+            </w:r>
+          </w:p>
+        </w:tc>
+      </w:tr>
+      <w:tr>
+        <w:tc>
+          <w:tcPr>
+            <w:tcW w:type="dxa" w:w="2613"/>
+            <w:vAlign w:val="center"/>
+            <w:textDirection w:val="rlTb"/>
+          </w:tcPr>
+          <w:p>
+            <w:pPr>
+              <w:bidi w:val="1"/>
+              <w:spacing w:after="60"/>
+              <w:jc w:val="right"/>
+            </w:pPr>
+            <w:r>
+              <w:rPr>
+                <w:rFonts w:ascii="DejaVu Sans" w:hAnsi="DejaVu Sans" w:cs="DejaVu Sans" w:eastAsia="DejaVu Sans"/>
+                <w:b w:val="0"/>
+                <w:color w:val="16354A"/>
+                <w:sz w:val="20"/>
+                <w:rtl w:val="1"/>
+              </w:rPr>
+              <w:t>status</w:t>
+            </w:r>
+          </w:p>
+        </w:tc>
+        <w:tc>
+          <w:tcPr>
+            <w:tcW w:type="dxa" w:w="2613"/>
+            <w:vAlign w:val="center"/>
+            <w:textDirection w:val="rlTb"/>
+          </w:tcPr>
+          <w:p>
+            <w:pPr>
+              <w:bidi w:val="1"/>
+              <w:spacing w:after="60"/>
+              <w:jc w:val="right"/>
+            </w:pPr>
+            <w:r>
+              <w:rPr>
+                <w:rFonts w:ascii="DejaVu Sans" w:hAnsi="DejaVu Sans" w:cs="DejaVu Sans" w:eastAsia="DejaVu Sans"/>
+                <w:b w:val="0"/>
+                <w:color w:val="16354A"/>
+                <w:sz w:val="20"/>
+                <w:rtl w:val="1"/>
+              </w:rPr>
+              <w:t>متن</w:t>
+            </w:r>
+          </w:p>
+        </w:tc>
+        <w:tc>
+          <w:tcPr>
+            <w:tcW w:type="dxa" w:w="2613"/>
+            <w:vAlign w:val="center"/>
+            <w:textDirection w:val="rlTb"/>
+          </w:tcPr>
+          <w:p>
+            <w:pPr>
+              <w:bidi w:val="1"/>
+              <w:spacing w:after="60"/>
+              <w:jc w:val="right"/>
+            </w:pPr>
+            <w:r>
+              <w:rPr>
+                <w:rFonts w:ascii="DejaVu Sans" w:hAnsi="DejaVu Sans" w:cs="DejaVu Sans" w:eastAsia="DejaVu Sans"/>
+                <w:b w:val="0"/>
+                <w:color w:val="16354A"/>
+                <w:sz w:val="20"/>
+                <w:rtl w:val="1"/>
+              </w:rPr>
+              <w:t>بله</w:t>
+            </w:r>
+          </w:p>
+        </w:tc>
+        <w:tc>
+          <w:tcPr>
+            <w:tcW w:type="dxa" w:w="2613"/>
+            <w:vAlign w:val="center"/>
+            <w:textDirection w:val="rlTb"/>
+          </w:tcPr>
+          <w:p>
+            <w:pPr>
+              <w:bidi w:val="1"/>
+              <w:spacing w:after="60"/>
+              <w:jc w:val="right"/>
+            </w:pPr>
+            <w:r>
+              <w:rPr>
+                <w:rFonts w:ascii="DejaVu Sans" w:hAnsi="DejaVu Sans" w:cs="DejaVu Sans" w:eastAsia="DejaVu Sans"/>
+                <w:b w:val="0"/>
+                <w:color w:val="16354A"/>
+                <w:sz w:val="20"/>
+                <w:rtl w:val="1"/>
+              </w:rPr>
+              <w:t>وضعیت</w:t>
+            </w:r>
+          </w:p>
+        </w:tc>
+      </w:tr>
+      <w:tr>
+        <w:tc>
+          <w:tcPr>
+            <w:tcW w:type="dxa" w:w="2613"/>
+            <w:vAlign w:val="center"/>
+            <w:textDirection w:val="rlTb"/>
+          </w:tcPr>
+          <w:p>
+            <w:pPr>
+              <w:bidi w:val="1"/>
+              <w:spacing w:after="60"/>
+              <w:jc w:val="right"/>
+            </w:pPr>
+            <w:r>
+              <w:rPr>
+                <w:rFonts w:ascii="DejaVu Sans" w:hAnsi="DejaVu Sans" w:cs="DejaVu Sans" w:eastAsia="DejaVu Sans"/>
+                <w:b w:val="0"/>
+                <w:color w:val="16354A"/>
+                <w:sz w:val="20"/>
+                <w:rtl w:val="1"/>
+              </w:rPr>
+              <w:t>created_at</w:t>
+            </w:r>
+          </w:p>
+        </w:tc>
+        <w:tc>
+          <w:tcPr>
+            <w:tcW w:type="dxa" w:w="2613"/>
+            <w:vAlign w:val="center"/>
+            <w:textDirection w:val="rlTb"/>
+          </w:tcPr>
+          <w:p>
+            <w:pPr>
+              <w:bidi w:val="1"/>
+              <w:spacing w:after="60"/>
+              <w:jc w:val="right"/>
+            </w:pPr>
+            <w:r>
+              <w:rPr>
+                <w:rFonts w:ascii="DejaVu Sans" w:hAnsi="DejaVu Sans" w:cs="DejaVu Sans" w:eastAsia="DejaVu Sans"/>
+                <w:b w:val="0"/>
+                <w:color w:val="16354A"/>
+                <w:sz w:val="20"/>
+                <w:rtl w:val="1"/>
+              </w:rPr>
+              <w:t>زمان</w:t>
+            </w:r>
+          </w:p>
+        </w:tc>
+        <w:tc>
+          <w:tcPr>
+            <w:tcW w:type="dxa" w:w="2613"/>
+            <w:vAlign w:val="center"/>
+            <w:textDirection w:val="rlTb"/>
+          </w:tcPr>
+          <w:p>
+            <w:pPr>
+              <w:bidi w:val="1"/>
+              <w:spacing w:after="60"/>
+              <w:jc w:val="right"/>
+            </w:pPr>
+            <w:r>
+              <w:rPr>
+                <w:rFonts w:ascii="DejaVu Sans" w:hAnsi="DejaVu Sans" w:cs="DejaVu Sans" w:eastAsia="DejaVu Sans"/>
+                <w:b w:val="0"/>
+                <w:color w:val="16354A"/>
+                <w:sz w:val="20"/>
+                <w:rtl w:val="1"/>
+              </w:rPr>
+              <w:t>بله</w:t>
+            </w:r>
+          </w:p>
+        </w:tc>
+        <w:tc>
+          <w:tcPr>
+            <w:tcW w:type="dxa" w:w="2613"/>
+            <w:vAlign w:val="center"/>
+            <w:textDirection w:val="rlTb"/>
+          </w:tcPr>
+          <w:p>
+            <w:pPr>
+              <w:bidi w:val="1"/>
+              <w:spacing w:after="60"/>
+              <w:jc w:val="right"/>
+            </w:pPr>
+            <w:r>
+              <w:rPr>
+                <w:rFonts w:ascii="DejaVu Sans" w:hAnsi="DejaVu Sans" w:cs="DejaVu Sans" w:eastAsia="DejaVu Sans"/>
+                <w:b w:val="0"/>
+                <w:color w:val="16354A"/>
+                <w:sz w:val="20"/>
+                <w:rtl w:val="1"/>
+              </w:rPr>
+              <w:t>زمان ثبت</w:t>
+            </w:r>
+          </w:p>
+        </w:tc>
+      </w:tr>
+      <w:tr>
+        <w:tc>
+          <w:tcPr>
+            <w:tcW w:type="dxa" w:w="2613"/>
+            <w:vAlign w:val="center"/>
+            <w:textDirection w:val="rlTb"/>
+          </w:tcPr>
+          <w:p>
+            <w:pPr>
+              <w:bidi w:val="1"/>
+              <w:spacing w:after="60"/>
+              <w:jc w:val="right"/>
+            </w:pPr>
+            <w:r>
+              <w:rPr>
+                <w:rFonts w:ascii="DejaVu Sans" w:hAnsi="DejaVu Sans" w:cs="DejaVu Sans" w:eastAsia="DejaVu Sans"/>
+                <w:b w:val="0"/>
+                <w:color w:val="16354A"/>
+                <w:sz w:val="20"/>
+                <w:rtl w:val="1"/>
+              </w:rPr>
+              <w:t>is_active</w:t>
+            </w:r>
+          </w:p>
+        </w:tc>
+        <w:tc>
+          <w:tcPr>
+            <w:tcW w:type="dxa" w:w="2613"/>
+            <w:vAlign w:val="center"/>
+            <w:textDirection w:val="rlTb"/>
+          </w:tcPr>
+          <w:p>
+            <w:pPr>
+              <w:bidi w:val="1"/>
+              <w:spacing w:after="60"/>
+              <w:jc w:val="right"/>
+            </w:pPr>
+            <w:r>
+              <w:rPr>
+                <w:rFonts w:ascii="DejaVu Sans" w:hAnsi="DejaVu Sans" w:cs="DejaVu Sans" w:eastAsia="DejaVu Sans"/>
+                <w:b w:val="0"/>
+                <w:color w:val="16354A"/>
+                <w:sz w:val="20"/>
+                <w:rtl w:val="1"/>
+              </w:rPr>
+              <w:t>درست/نادرست</w:t>
+            </w:r>
+          </w:p>
+        </w:tc>
+        <w:tc>
+          <w:tcPr>
+            <w:tcW w:type="dxa" w:w="2613"/>
+            <w:vAlign w:val="center"/>
+            <w:textDirection w:val="rlTb"/>
+          </w:tcPr>
+          <w:p>
+            <w:pPr>
+              <w:bidi w:val="1"/>
+              <w:spacing w:after="60"/>
+              <w:jc w:val="right"/>
+            </w:pPr>
+            <w:r>
+              <w:rPr>
+                <w:rFonts w:ascii="DejaVu Sans" w:hAnsi="DejaVu Sans" w:cs="DejaVu Sans" w:eastAsia="DejaVu Sans"/>
+                <w:b w:val="0"/>
+                <w:color w:val="16354A"/>
+                <w:sz w:val="20"/>
+                <w:rtl w:val="1"/>
+              </w:rPr>
+              <w:t>خیر</w:t>
+            </w:r>
+          </w:p>
+        </w:tc>
+        <w:tc>
+          <w:tcPr>
+            <w:tcW w:type="dxa" w:w="2613"/>
+            <w:vAlign w:val="center"/>
+            <w:textDirection w:val="rlTb"/>
+          </w:tcPr>
+          <w:p>
+            <w:pPr>
+              <w:bidi w:val="1"/>
+              <w:spacing w:after="60"/>
+              <w:jc w:val="right"/>
+            </w:pPr>
+            <w:r>
+              <w:rPr>
+                <w:rFonts w:ascii="DejaVu Sans" w:hAnsi="DejaVu Sans" w:cs="DejaVu Sans" w:eastAsia="DejaVu Sans"/>
+                <w:b w:val="0"/>
+                <w:color w:val="16354A"/>
+                <w:sz w:val="20"/>
+                <w:rtl w:val="1"/>
+              </w:rPr>
+              <w:t>فعال بودن</w:t>
+            </w:r>
+          </w:p>
+        </w:tc>
+      </w:tr>
+    </w:tbl>
+    <w:p>
+      <w:pPr>
+        <w:spacing w:after="40"/>
+      </w:pPr>
+    </w:p>
+    <w:p>
+      <w:pPr>
+        <w:keepLines w:val="0"/>
+        <w:bidi w:val="1"/>
+        <w:jc w:val="right"/>
+      </w:pPr>
+      <w:r>
+        <w:rPr>
+          <w:rFonts w:ascii="DejaVu Sans" w:hAnsi="DejaVu Sans" w:cs="DejaVu Sans" w:eastAsia="DejaVu Sans"/>
+          <w:b w:val="0"/>
+          <w:color w:val="000000"/>
+          <w:sz w:val="21"/>
+          <w:rtl w:val="1"/>
+        </w:rPr>
+        <w:t xml:space="preserve">«تهی‌پذیر» یعنی آن ستون می‌تواند مقدار خالی داشته باشد. جدول فقط نمونه است و ستون‌های واقعی محیط شما ممکن است نام و نوع دیگری داشته باشند. این فراخوانی به تاریخ نیاز دارد، اما به سقف ردیف یا تعداد فایل نیاز ندارد. پس از دیدن جدول، همان </w:t>
+      </w:r>
+      <w:r>
+        <w:rPr>
+          <w:rFonts w:ascii="DejaVu Sans Mono" w:hAnsi="DejaVu Sans Mono" w:cs="DejaVu Sans Mono" w:eastAsia="DejaVu Sans Mono"/>
+          <w:color w:val="233142"/>
+          <w:sz w:val="19"/>
+        </w:rPr>
+        <w:t>query</w:t>
+      </w:r>
+      <w:r>
+        <w:rPr>
+          <w:rFonts w:ascii="DejaVu Sans" w:hAnsi="DejaVu Sans" w:cs="DejaVu Sans" w:eastAsia="DejaVu Sans"/>
+          <w:b w:val="0"/>
+          <w:color w:val="000000"/>
+          <w:sz w:val="21"/>
+          <w:rtl w:val="1"/>
+        </w:rPr>
+        <w:t xml:space="preserve"> را برای شرط‌ها و اجرای خروجی ادامه دهید.</w:t>
+      </w:r>
+    </w:p>
+    <w:p>
+      <w:pPr>
+        <w:pStyle w:val="Heading1"/>
+        <w:keepLines/>
+        <w:bidi w:val="1"/>
+        <w:jc w:val="right"/>
+      </w:pPr>
+      <w:r>
+        <w:rPr>
+          <w:rFonts w:ascii="DejaVu Sans" w:hAnsi="DejaVu Sans" w:cs="DejaVu Sans" w:eastAsia="DejaVu Sans"/>
+          <w:b/>
+          <w:color w:val="000000"/>
+          <w:sz w:val="30"/>
+          <w:rtl w:val="1"/>
+        </w:rPr>
+        <w:t>۳. شرط و ستون‌های نتیجه را انتخاب کنید</w:t>
+      </w:r>
+    </w:p>
+    <w:p>
+      <w:pPr>
+        <w:keepLines w:val="0"/>
+        <w:bidi w:val="1"/>
+        <w:jc w:val="right"/>
+      </w:pPr>
+      <w:r>
+        <w:rPr>
+          <w:rFonts w:ascii="DejaVu Sans" w:hAnsi="DejaVu Sans" w:cs="DejaVu Sans" w:eastAsia="DejaVu Sans"/>
+          <w:b w:val="0"/>
+          <w:color w:val="000000"/>
+          <w:sz w:val="21"/>
+          <w:rtl w:val="1"/>
+        </w:rPr>
+        <w:t xml:space="preserve">نام ستون‌های واقعی جدول را جایگزین نمونه‌های </w:t>
+      </w:r>
+      <w:r>
+        <w:rPr>
+          <w:rFonts w:ascii="DejaVu Sans Mono" w:hAnsi="DejaVu Sans Mono" w:cs="DejaVu Sans Mono" w:eastAsia="DejaVu Sans Mono"/>
+          <w:color w:val="233142"/>
+          <w:sz w:val="19"/>
+        </w:rPr>
+        <w:t>customer_id</w:t>
+      </w:r>
+      <w:r>
+        <w:rPr>
+          <w:rFonts w:ascii="DejaVu Sans" w:hAnsi="DejaVu Sans" w:cs="DejaVu Sans" w:eastAsia="DejaVu Sans"/>
+          <w:b w:val="0"/>
+          <w:color w:val="000000"/>
+          <w:sz w:val="21"/>
+          <w:rtl w:val="1"/>
+        </w:rPr>
+        <w:t xml:space="preserve"> و </w:t>
+      </w:r>
+      <w:r>
+        <w:rPr>
+          <w:rFonts w:ascii="DejaVu Sans Mono" w:hAnsi="DejaVu Sans Mono" w:cs="DejaVu Sans Mono" w:eastAsia="DejaVu Sans Mono"/>
+          <w:color w:val="233142"/>
+          <w:sz w:val="19"/>
+        </w:rPr>
+        <w:t>status</w:t>
+      </w:r>
+      <w:r>
+        <w:rPr>
+          <w:rFonts w:ascii="DejaVu Sans" w:hAnsi="DejaVu Sans" w:cs="DejaVu Sans" w:eastAsia="DejaVu Sans"/>
+          <w:b w:val="0"/>
+          <w:color w:val="000000"/>
+          <w:sz w:val="21"/>
+          <w:rtl w:val="1"/>
+        </w:rPr>
+        <w:t xml:space="preserve"> کنید. رشته‌ها داخل کوتیشن و اعداد بدون کوتیشن نوشته می‌شوند. برای شرط‌ها از عملگرهای Spark استفاده کنید: </w:t>
+      </w:r>
+      <w:r>
+        <w:rPr>
+          <w:rFonts w:ascii="DejaVu Sans Mono" w:hAnsi="DejaVu Sans Mono" w:cs="DejaVu Sans Mono" w:eastAsia="DejaVu Sans Mono"/>
+          <w:color w:val="233142"/>
+          <w:sz w:val="19"/>
+        </w:rPr>
+        <w:t>&amp;</w:t>
+      </w:r>
+      <w:r>
+        <w:rPr>
+          <w:rFonts w:ascii="DejaVu Sans" w:hAnsi="DejaVu Sans" w:cs="DejaVu Sans" w:eastAsia="DejaVu Sans"/>
+          <w:b w:val="0"/>
+          <w:color w:val="000000"/>
+          <w:sz w:val="21"/>
+          <w:rtl w:val="1"/>
+        </w:rPr>
+        <w:t xml:space="preserve"> یعنی «و»، </w:t>
+      </w:r>
+      <w:r>
+        <w:rPr>
+          <w:rFonts w:ascii="DejaVu Sans Mono" w:hAnsi="DejaVu Sans Mono" w:cs="DejaVu Sans Mono" w:eastAsia="DejaVu Sans Mono"/>
+          <w:color w:val="233142"/>
+          <w:sz w:val="19"/>
+        </w:rPr>
+        <w:t>|</w:t>
+      </w:r>
+      <w:r>
+        <w:rPr>
+          <w:rFonts w:ascii="DejaVu Sans" w:hAnsi="DejaVu Sans" w:cs="DejaVu Sans" w:eastAsia="DejaVu Sans"/>
+          <w:b w:val="0"/>
+          <w:color w:val="000000"/>
+          <w:sz w:val="21"/>
+          <w:rtl w:val="1"/>
+        </w:rPr>
+        <w:t xml:space="preserve"> یعنی «یا»، و </w:t>
+      </w:r>
+      <w:r>
+        <w:rPr>
+          <w:rFonts w:ascii="DejaVu Sans Mono" w:hAnsi="DejaVu Sans Mono" w:cs="DejaVu Sans Mono" w:eastAsia="DejaVu Sans Mono"/>
+          <w:color w:val="233142"/>
+          <w:sz w:val="19"/>
+        </w:rPr>
+        <w:t>~</w:t>
+      </w:r>
+      <w:r>
+        <w:rPr>
+          <w:rFonts w:ascii="DejaVu Sans" w:hAnsi="DejaVu Sans" w:cs="DejaVu Sans" w:eastAsia="DejaVu Sans"/>
+          <w:b w:val="0"/>
+          <w:color w:val="000000"/>
+          <w:sz w:val="21"/>
+          <w:rtl w:val="1"/>
+        </w:rPr>
+        <w:t xml:space="preserve"> یعنی «نقیض». هر مقایسه را در پرانتز بگذارید. در این قسمت </w:t>
+      </w:r>
+      <w:r>
+        <w:rPr>
+          <w:rFonts w:ascii="DejaVu Sans Mono" w:hAnsi="DejaVu Sans Mono" w:cs="DejaVu Sans Mono" w:eastAsia="DejaVu Sans Mono"/>
+          <w:color w:val="233142"/>
+          <w:sz w:val="19"/>
+        </w:rPr>
+        <w:t>where</w:t>
+      </w:r>
+      <w:r>
+        <w:rPr>
+          <w:rFonts w:ascii="DejaVu Sans" w:hAnsi="DejaVu Sans" w:cs="DejaVu Sans" w:eastAsia="DejaVu Sans"/>
+          <w:b w:val="0"/>
+          <w:color w:val="000000"/>
+          <w:sz w:val="21"/>
+          <w:rtl w:val="1"/>
+        </w:rPr>
+        <w:t xml:space="preserve"> باید با </w:t>
+      </w:r>
+      <w:r>
+        <w:rPr>
+          <w:rFonts w:ascii="DejaVu Sans Mono" w:hAnsi="DejaVu Sans Mono" w:cs="DejaVu Sans Mono" w:eastAsia="DejaVu Sans Mono"/>
+          <w:color w:val="233142"/>
+          <w:sz w:val="19"/>
+        </w:rPr>
+        <w:t>query.</w:t>
+      </w:r>
+      <w:r>
+        <w:rPr>
+          <w:rFonts w:ascii="DejaVu Sans" w:hAnsi="DejaVu Sans" w:cs="DejaVu Sans" w:eastAsia="DejaVu Sans"/>
+          <w:b w:val="0"/>
+          <w:color w:val="000000"/>
+          <w:sz w:val="21"/>
+          <w:rtl w:val="1"/>
+        </w:rPr>
+        <w:t xml:space="preserve"> نوشته شود.</w:t>
       </w:r>
     </w:p>
     <w:p>
       <w:pPr>
         <w:keepLines/>
-        <w:spacing w:after="40"/>
+        <w:bidi w:val="0"/>
+        <w:spacing w:after="120"/>
+        <w:ind w:left="360" w:right="360"/>
         <w:jc w:val="left"/>
       </w:pPr>
       <w:r>
         <w:rPr>
-          <w:rFonts w:ascii="DejaVu Sans Mono" w:hAnsi="DejaVu Sans Mono" w:cs="DejaVu Sans"/>
+          <w:rFonts w:ascii="DejaVu Sans Mono" w:hAnsi="DejaVu Sans Mono" w:cs="DejaVu Sans Mono" w:eastAsia="DejaVu Sans Mono"/>
+          <w:color w:val="233142"/>
           <w:sz w:val="18"/>
         </w:rPr>
-        <w:t>from data_extractor import Query</w:t>
+        <w:t>from pyspark.sql.functions import col</w:t>
+        <w:br/>
+        <w:br/>
+        <w:t>query.where((col("customer_id") &gt; 10) &amp; (col("status") == "ready"))</w:t>
+        <w:br/>
+        <w:t>query.select("customer_id", "status")</w:t>
+        <w:br/>
+        <w:t>query.limit(100_000)</w:t>
+        <w:br/>
+        <w:t>query.output_files(4)</w:t>
+        <w:br/>
+        <w:t>query.run()</w:t>
       </w:r>
     </w:p>
     <w:p>
       <w:pPr>
         <w:keepLines/>
-        <w:spacing w:after="40"/>
-        <w:jc w:val="left"/>
+        <w:bidi w:val="1"/>
+        <w:jc w:val="right"/>
       </w:pPr>
       <w:r>
         <w:rPr>
-          <w:rFonts w:ascii="DejaVu Sans Mono" w:hAnsi="DejaVu Sans Mono" w:cs="DejaVu Sans"/>
-          <w:sz w:val="18"/>
+          <w:rFonts w:ascii="DejaVu Sans" w:hAnsi="DejaVu Sans" w:cs="DejaVu Sans" w:eastAsia="DejaVu Sans"/>
+          <w:b w:val="0"/>
+          <w:color w:val="000000"/>
+          <w:sz w:val="21"/>
+          <w:rtl w:val="1"/>
         </w:rPr>
-        <w:t>query = Query("customer_search")</w:t>
+        <w:t xml:space="preserve">برای انتخاب همهٔ ستون‌ها، خط </w:t>
+      </w:r>
+      <w:r>
+        <w:rPr>
+          <w:rFonts w:ascii="DejaVu Sans Mono" w:hAnsi="DejaVu Sans Mono" w:cs="DejaVu Sans Mono" w:eastAsia="DejaVu Sans Mono"/>
+          <w:color w:val="233142"/>
+          <w:sz w:val="19"/>
+        </w:rPr>
+        <w:t>query.select(...)</w:t>
+      </w:r>
+      <w:r>
+        <w:rPr>
+          <w:rFonts w:ascii="DejaVu Sans" w:hAnsi="DejaVu Sans" w:cs="DejaVu Sans" w:eastAsia="DejaVu Sans"/>
+          <w:b w:val="0"/>
+          <w:color w:val="000000"/>
+          <w:sz w:val="21"/>
+          <w:rtl w:val="1"/>
+        </w:rPr>
+        <w:t xml:space="preserve"> را حذف کنید. هر بار که </w:t>
+      </w:r>
+      <w:r>
+        <w:rPr>
+          <w:rFonts w:ascii="DejaVu Sans Mono" w:hAnsi="DejaVu Sans Mono" w:cs="DejaVu Sans Mono" w:eastAsia="DejaVu Sans Mono"/>
+          <w:color w:val="233142"/>
+          <w:sz w:val="19"/>
+        </w:rPr>
+        <w:t>where</w:t>
+      </w:r>
+      <w:r>
+        <w:rPr>
+          <w:rFonts w:ascii="DejaVu Sans" w:hAnsi="DejaVu Sans" w:cs="DejaVu Sans" w:eastAsia="DejaVu Sans"/>
+          <w:b w:val="0"/>
+          <w:color w:val="000000"/>
+          <w:sz w:val="21"/>
+          <w:rtl w:val="1"/>
+        </w:rPr>
+        <w:t xml:space="preserve"> را صدا می‌زنید شرط تازه با «و» به شرط‌های پیشین اضافه می‌شود. </w:t>
+      </w:r>
+      <w:r>
+        <w:rPr>
+          <w:rFonts w:ascii="DejaVu Sans Mono" w:hAnsi="DejaVu Sans Mono" w:cs="DejaVu Sans Mono" w:eastAsia="DejaVu Sans Mono"/>
+          <w:color w:val="233142"/>
+          <w:sz w:val="19"/>
+        </w:rPr>
+        <w:t>limit</w:t>
+      </w:r>
+      <w:r>
+        <w:rPr>
+          <w:rFonts w:ascii="DejaVu Sans" w:hAnsi="DejaVu Sans" w:cs="DejaVu Sans" w:eastAsia="DejaVu Sans"/>
+          <w:b w:val="0"/>
+          <w:color w:val="000000"/>
+          <w:sz w:val="21"/>
+          <w:rtl w:val="1"/>
+        </w:rPr>
+        <w:t xml:space="preserve"> سقف تعداد ردیف‌های خروجی است، نه سقف حجم داده‌ای که سامانه باید بخواند؛ حتی خروجی کم هم ممکن است زمان‌بر باشد. انتخاب ردیف‌ها با </w:t>
+      </w:r>
+      <w:r>
+        <w:rPr>
+          <w:rFonts w:ascii="DejaVu Sans Mono" w:hAnsi="DejaVu Sans Mono" w:cs="DejaVu Sans Mono" w:eastAsia="DejaVu Sans Mono"/>
+          <w:color w:val="233142"/>
+          <w:sz w:val="19"/>
+        </w:rPr>
+        <w:t>limit</w:t>
+      </w:r>
+      <w:r>
+        <w:rPr>
+          <w:rFonts w:ascii="DejaVu Sans" w:hAnsi="DejaVu Sans" w:cs="DejaVu Sans" w:eastAsia="DejaVu Sans"/>
+          <w:b w:val="0"/>
+          <w:color w:val="000000"/>
+          <w:sz w:val="21"/>
+          <w:rtl w:val="1"/>
+        </w:rPr>
+        <w:t xml:space="preserve"> ترتیب ثابتی ندارد. عدد </w:t>
+      </w:r>
+      <w:r>
+        <w:rPr>
+          <w:rFonts w:ascii="DejaVu Sans Mono" w:hAnsi="DejaVu Sans Mono" w:cs="DejaVu Sans Mono" w:eastAsia="DejaVu Sans Mono"/>
+          <w:color w:val="233142"/>
+          <w:sz w:val="19"/>
+        </w:rPr>
+        <w:t>output_files</w:t>
+      </w:r>
+      <w:r>
+        <w:rPr>
+          <w:rFonts w:ascii="DejaVu Sans" w:hAnsi="DejaVu Sans" w:cs="DejaVu Sans" w:eastAsia="DejaVu Sans"/>
+          <w:b w:val="0"/>
+          <w:color w:val="000000"/>
+          <w:sz w:val="21"/>
+          <w:rtl w:val="1"/>
+        </w:rPr>
+        <w:t xml:space="preserve"> تعداد هدف پارتیشن‌هاست؛ تعداد واقعی فایل‌ها ممکن است کمتر یا بیشتر باشد و پس از پایان گزارش می‌شود.</w:t>
+      </w:r>
+    </w:p>
+    <w:p>
+      <w:pPr>
+        <w:keepLines w:val="0"/>
+        <w:bidi w:val="1"/>
+        <w:jc w:val="right"/>
+      </w:pPr>
+      <w:r>
+        <w:rPr>
+          <w:rFonts w:ascii="DejaVu Sans" w:hAnsi="DejaVu Sans" w:cs="DejaVu Sans" w:eastAsia="DejaVu Sans"/>
+          <w:b w:val="0"/>
+          <w:color w:val="000000"/>
+          <w:sz w:val="21"/>
+          <w:rtl w:val="1"/>
+        </w:rPr>
+        <w:t xml:space="preserve">نمونه‌های زیر راه‌های جایگزین‌اند؛ همه را پشت سر هم اجرا نکنید، چون هر </w:t>
+      </w:r>
+      <w:r>
+        <w:rPr>
+          <w:rFonts w:ascii="DejaVu Sans Mono" w:hAnsi="DejaVu Sans Mono" w:cs="DejaVu Sans Mono" w:eastAsia="DejaVu Sans Mono"/>
+          <w:color w:val="233142"/>
+          <w:sz w:val="19"/>
+        </w:rPr>
+        <w:t>where</w:t>
+      </w:r>
+      <w:r>
+        <w:rPr>
+          <w:rFonts w:ascii="DejaVu Sans" w:hAnsi="DejaVu Sans" w:cs="DejaVu Sans" w:eastAsia="DejaVu Sans"/>
+          <w:b w:val="0"/>
+          <w:color w:val="000000"/>
+          <w:sz w:val="21"/>
+          <w:rtl w:val="1"/>
+        </w:rPr>
+        <w:t xml:space="preserve"> شرط تازه را با «و» به شرط‌های قبلی اضافه می‌کند:</w:t>
       </w:r>
     </w:p>
     <w:p>
       <w:pPr>
         <w:keepLines/>
-        <w:spacing w:after="40"/>
+        <w:bidi w:val="0"/>
+        <w:spacing w:after="120"/>
+        <w:ind w:left="360" w:right="360"/>
         <w:jc w:val="left"/>
       </w:pPr>
       <w:r>
         <w:rPr>
-          <w:rFonts w:ascii="DejaVu Sans Mono" w:hAnsi="DejaVu Sans Mono" w:cs="DejaVu Sans"/>
+          <w:rFonts w:ascii="DejaVu Sans Mono" w:hAnsi="DejaVu Sans Mono" w:cs="DejaVu Sans Mono" w:eastAsia="DejaVu Sans Mono"/>
+          <w:color w:val="233142"/>
           <w:sz w:val="18"/>
         </w:rPr>
-        <w:t>query.between("2026-01-01", "2026-01-07")</w:t>
+        <w:t># «یا»</w:t>
+        <w:br/>
+        <w:t>query.where((col("status") == "ready") | (col("status") == "waiting"))</w:t>
+        <w:br/>
+        <w:br/>
+        <w:t># شروع متن با عبارت</w:t>
+        <w:br/>
+        <w:t>query.where(col("status").startswith("re"))</w:t>
+        <w:br/>
+        <w:br/>
+        <w:t># نقیض؛ وضعیت‌هایی به‌جز ready</w:t>
+        <w:br/>
+        <w:t>query.where(~(col("status") == "ready"))</w:t>
+        <w:br/>
+      </w:r>
+    </w:p>
+    <w:p>
+      <w:pPr>
+        <w:pStyle w:val="Heading1"/>
+        <w:keepLines/>
+        <w:bidi w:val="1"/>
+        <w:jc w:val="right"/>
+      </w:pPr>
+      <w:r>
+        <w:rPr>
+          <w:rFonts w:ascii="DejaVu Sans" w:hAnsi="DejaVu Sans" w:cs="DejaVu Sans" w:eastAsia="DejaVu Sans"/>
+          <w:b/>
+          <w:color w:val="000000"/>
+          <w:sz w:val="30"/>
+          <w:rtl w:val="1"/>
+        </w:rPr>
+        <w:t>۴. پایان کار و دریافت فایل</w:t>
+      </w:r>
+    </w:p>
+    <w:p>
+      <w:pPr>
+        <w:keepLines w:val="0"/>
+        <w:bidi w:val="1"/>
+        <w:jc w:val="right"/>
+      </w:pPr>
+      <w:r>
+        <w:rPr>
+          <w:rFonts w:ascii="DejaVu Sans" w:hAnsi="DejaVu Sans" w:cs="DejaVu Sans" w:eastAsia="DejaVu Sans"/>
+          <w:b w:val="0"/>
+          <w:color w:val="000000"/>
+          <w:sz w:val="21"/>
+          <w:rtl w:val="1"/>
+        </w:rPr>
+        <w:t>تا پیام پایان سلول صبر کنید. پیام خلاصه شامل نام جست‌وجو، شناسهٔ اجرا، تاریخ اجرای تهران، مدت، تعداد ردیف‌های اندازه‌گیری‌شده، تعداد فایل‌های واقعی و فرمان دریافت است. تاریخ فرمان تاریخ اجرای جست‌وجو در تهران است؛ ممکن است با تاریخ داده‌ها فرق کند. فرمان را روی دستگاه لینوکسی‌ای اجرا کنید که مدیر برای دریافت آماده کرده است.</w:t>
       </w:r>
     </w:p>
     <w:p>
       <w:pPr>
         <w:keepLines/>
-        <w:spacing w:after="40"/>
+        <w:bidi w:val="0"/>
+        <w:spacing w:after="120"/>
+        <w:ind w:left="360" w:right="360"/>
         <w:jc w:val="left"/>
       </w:pPr>
       <w:r>
         <w:rPr>
-          <w:rFonts w:ascii="DejaVu Sans Mono" w:hAnsi="DejaVu Sans Mono" w:cs="DejaVu Sans"/>
-          <w:sz w:val="18"/>
-        </w:rPr>
-        <w:t>query.where((col("a") &gt; 10) &amp; col("b").startswith("asdasa"))</w:t>
-      </w:r>
-    </w:p>
-    <w:p>
-      <w:pPr>
-        <w:keepLines/>
-        <w:spacing w:after="40"/>
-        <w:jc w:val="left"/>
-      </w:pPr>
-      <w:r>
-        <w:rPr>
-          <w:rFonts w:ascii="DejaVu Sans Mono" w:hAnsi="DejaVu Sans Mono" w:cs="DejaVu Sans"/>
-          <w:sz w:val="18"/>
-        </w:rPr>
-        <w:t>query.select("a", "b", "c")</w:t>
-      </w:r>
-    </w:p>
-    <w:p>
-      <w:pPr>
-        <w:keepLines/>
-        <w:spacing w:after="40"/>
-        <w:jc w:val="left"/>
-      </w:pPr>
-      <w:r>
-        <w:rPr>
-          <w:rFonts w:ascii="DejaVu Sans Mono" w:hAnsi="DejaVu Sans Mono" w:cs="DejaVu Sans"/>
-          <w:sz w:val="18"/>
-        </w:rPr>
-        <w:t>query.limit(1_000_000)</w:t>
-      </w:r>
-    </w:p>
-    <w:p>
-      <w:pPr>
-        <w:keepLines/>
-        <w:spacing w:after="40"/>
-        <w:jc w:val="left"/>
-      </w:pPr>
-      <w:r>
-        <w:rPr>
-          <w:rFonts w:ascii="DejaVu Sans Mono" w:hAnsi="DejaVu Sans Mono" w:cs="DejaVu Sans"/>
-          <w:sz w:val="18"/>
-        </w:rPr>
-        <w:t>query.output_files(4)</w:t>
-      </w:r>
-    </w:p>
-    <w:p>
-      <w:pPr>
-        <w:keepLines/>
-        <w:spacing w:after="40"/>
-        <w:jc w:val="left"/>
-      </w:pPr>
-      <w:r>
-        <w:rPr>
-          <w:rFonts w:ascii="DejaVu Sans Mono" w:hAnsi="DejaVu Sans Mono" w:cs="DejaVu Sans"/>
-          <w:sz w:val="18"/>
-        </w:rPr>
-        <w:t>query.run()</w:t>
-      </w:r>
-    </w:p>
-    <w:p>
-      <w:pPr>
-        <w:jc w:val="right"/>
-        <w:keepLines/>
-        <w:bidi w:val="1"/>
-      </w:pPr>
-      <w:r>
-        <w:rPr>
-          <w:rFonts w:ascii="DejaVu Sans" w:hAnsi="DejaVu Sans" w:cs="DejaVu Sans"/>
-          <w:sz w:val="22"/>
-          <w:rtl w:val="1"/>
-        </w:rPr>
-        <w:t>تاریخ‌ها با قالب سال ماه روز انگلیسی نوشته می‌شوند و هر دو روز ابتدا و پایان در بازه هستند. بازه باید یک تا هفت روز باشد. نبودن داده حتی برای یک روز خطاست. limit و output_files الزامی‌اند. سقف رکورد باید عدد صحیح مثبت و حداکثر یک میلیارد باشد؛ مدیر می‌تواند سقف پایین‌تری تعیین کند. اگر رکوردهای مطابق شرط کمتر باشند، نتیجه کوچک‌تر خواهد بود. ترتیب یا انتخاب رکوردها تضمین‌شده نیست.</w:t>
-      </w:r>
-    </w:p>
-    <w:p>
-      <w:pPr>
-        <w:pStyle w:val="Heading1"/>
-        <w:jc w:val="right"/>
-        <w:keepLines/>
-        <w:bidi w:val="1"/>
-      </w:pPr>
-      <w:r>
-        <w:rPr>
-          <w:rFonts w:ascii="DejaVu Sans" w:hAnsi="DejaVu Sans" w:cs="DejaVu Sans"/>
-          <w:sz w:val="28"/>
-          <w:rtl w:val="1"/>
-        </w:rPr>
-        <w:t>نوشتن شرط‌ها</w:t>
-      </w:r>
-    </w:p>
-    <w:p>
-      <w:pPr>
-        <w:jc w:val="right"/>
-        <w:keepLines/>
-        <w:bidi w:val="1"/>
-      </w:pPr>
-      <w:r>
-        <w:rPr>
-          <w:rFonts w:ascii="DejaVu Sans" w:hAnsi="DejaVu Sans" w:cs="DejaVu Sans"/>
-          <w:sz w:val="22"/>
-          <w:rtl w:val="1"/>
-        </w:rPr>
-        <w:t>عملگر &amp; یعنی «و»، | یعنی «یا» و ~ یعنی «نقیض». هر مقایسه را در پرانتز قرار دهید. در شرط‌های Spark از and و or پایتون استفاده نکنید. col نام ستون را می‌گیرد. startswith برای آغاز رشته است. نوع ستون باید با مقایسه سازگار باشد؛ عدد را با ستون عددی و متن را با ستون متنی مقایسه کنید.</w:t>
-      </w:r>
-    </w:p>
-    <w:p>
-      <w:pPr>
-        <w:keepLines/>
-        <w:spacing w:after="40"/>
-        <w:jc w:val="left"/>
-      </w:pPr>
-      <w:r>
-        <w:rPr>
-          <w:rFonts w:ascii="DejaVu Sans Mono" w:hAnsi="DejaVu Sans Mono" w:cs="DejaVu Sans"/>
-          <w:sz w:val="18"/>
-        </w:rPr>
-        <w:t># AND</w:t>
-      </w:r>
-    </w:p>
-    <w:p>
-      <w:pPr>
-        <w:keepLines/>
-        <w:spacing w:after="40"/>
-        <w:jc w:val="left"/>
-      </w:pPr>
-      <w:r>
-        <w:rPr>
-          <w:rFonts w:ascii="DejaVu Sans Mono" w:hAnsi="DejaVu Sans Mono" w:cs="DejaVu Sans"/>
-          <w:sz w:val="18"/>
-        </w:rPr>
-        <w:t>.where((col("a") &gt; 10) &amp; (col("a") &lt; 100))</w:t>
-      </w:r>
-    </w:p>
-    <w:p>
-      <w:pPr>
-        <w:keepLines/>
-        <w:spacing w:after="40"/>
-        <w:jc w:val="left"/>
-      </w:pPr>
-      <w:r>
-        <w:rPr>
-          <w:rFonts w:ascii="DejaVu Sans Mono" w:hAnsi="DejaVu Sans Mono" w:cs="DejaVu Sans"/>
-          <w:sz w:val="18"/>
-        </w:rPr>
-        <w:t># OR</w:t>
-      </w:r>
-    </w:p>
-    <w:p>
-      <w:pPr>
-        <w:keepLines/>
-        <w:spacing w:after="40"/>
-        <w:jc w:val="left"/>
-      </w:pPr>
-      <w:r>
-        <w:rPr>
-          <w:rFonts w:ascii="DejaVu Sans Mono" w:hAnsi="DejaVu Sans Mono" w:cs="DejaVu Sans"/>
-          <w:sz w:val="18"/>
-        </w:rPr>
-        <w:t>.where((col("b") == "ready") | col("b").startswith("ok"))</w:t>
-      </w:r>
-    </w:p>
-    <w:p>
-      <w:pPr>
-        <w:keepLines/>
-        <w:spacing w:after="40"/>
-        <w:jc w:val="left"/>
-      </w:pPr>
-      <w:r>
-        <w:rPr>
-          <w:rFonts w:ascii="DejaVu Sans Mono" w:hAnsi="DejaVu Sans Mono" w:cs="DejaVu Sans"/>
-          <w:sz w:val="18"/>
-        </w:rPr>
-        <w:t># NOT</w:t>
-      </w:r>
-    </w:p>
-    <w:p>
-      <w:pPr>
-        <w:keepLines/>
-        <w:spacing w:after="40"/>
-        <w:jc w:val="left"/>
-      </w:pPr>
-      <w:r>
-        <w:rPr>
-          <w:rFonts w:ascii="DejaVu Sans Mono" w:hAnsi="DejaVu Sans Mono" w:cs="DejaVu Sans"/>
-          <w:sz w:val="18"/>
-        </w:rPr>
-        <w:t>.where(~(col("b") == "cancelled"))</w:t>
-      </w:r>
-    </w:p>
-    <w:p>
-      <w:pPr>
-        <w:keepLines/>
-        <w:spacing w:after="40"/>
-        <w:jc w:val="left"/>
-      </w:pPr>
-      <w:r>
-        <w:rPr>
-          <w:rFonts w:ascii="DejaVu Sans Mono" w:hAnsi="DejaVu Sans Mono" w:cs="DejaVu Sans"/>
-          <w:sz w:val="18"/>
-        </w:rPr>
-        <w:t># NULL</w:t>
-      </w:r>
-    </w:p>
-    <w:p>
-      <w:pPr>
-        <w:keepLines/>
-        <w:spacing w:after="40"/>
-        <w:jc w:val="left"/>
-      </w:pPr>
-      <w:r>
-        <w:rPr>
-          <w:rFonts w:ascii="DejaVu Sans Mono" w:hAnsi="DejaVu Sans Mono" w:cs="DejaVu Sans"/>
-          <w:sz w:val="18"/>
-        </w:rPr>
-        <w:t>.where(col("b").isNotNull())</w:t>
-      </w:r>
-    </w:p>
-    <w:p>
-      <w:pPr>
-        <w:jc w:val="right"/>
-        <w:keepLines/>
-        <w:bidi w:val="1"/>
-      </w:pPr>
-      <w:r>
-        <w:rPr>
-          <w:rFonts w:ascii="DejaVu Sans" w:hAnsi="DejaVu Sans" w:cs="DejaVu Sans"/>
-          <w:sz w:val="22"/>
-          <w:rtl w:val="1"/>
-        </w:rPr>
-        <w:t>چند where پشت سر هم با «و» ترکیب می‌شوند. select فقط نام ستون‌های موجود و بدون تکرار را می‌پذیرد. اگر select را ننویسید همه ستون‌ها انتخاب می‌شوند. output_files تعداد پارتیشن هدف است؛ تعداد واقعی فایل‌ها ممکن است کمتر یا بیشتر شود و در پیام پایان نمایش داده می‌شود. اگر تعداد رکورد برنامه‌ریزی‌شده برای هر فایل زیاد باشد، تعداد فایل هدف را افزایش دهید.</w:t>
-      </w:r>
-    </w:p>
-    <w:p>
-      <w:pPr>
-        <w:pStyle w:val="Heading1"/>
-        <w:jc w:val="right"/>
-        <w:keepLines/>
-        <w:bidi w:val="1"/>
-      </w:pPr>
-      <w:r>
-        <w:rPr>
-          <w:rFonts w:ascii="DejaVu Sans" w:hAnsi="DejaVu Sans" w:cs="DejaVu Sans"/>
-          <w:sz w:val="28"/>
-          <w:rtl w:val="1"/>
-        </w:rPr>
-        <w:t>پیام پایان و دریافت فایل‌ها</w:t>
-      </w:r>
-    </w:p>
-    <w:p>
-      <w:pPr>
-        <w:jc w:val="right"/>
-        <w:keepLines/>
-        <w:bidi w:val="1"/>
-      </w:pPr>
-      <w:r>
-        <w:rPr>
-          <w:rFonts w:ascii="DejaVu Sans" w:hAnsi="DejaVu Sans" w:cs="DejaVu Sans"/>
-          <w:sz w:val="22"/>
-          <w:rtl w:val="1"/>
-        </w:rPr>
-        <w:t>در پایان، نام جست‌وجو، شناسه اجرا، تاریخ اجرای تهران، مدت اجرا، تعداد اندازه‌گیری‌شده رکورد و فایل و فرمان دریافت نمایش داده می‌شود. تاریخ فرمان، تاریخ اجرای جست‌وجو است و ممکن است با تاریخ داده‌ها متفاوت باشد. فرمان چاپ‌شده را روی دستگاه لینوکسی آماده‌شده برای دریافت اجرا کنید.</w:t>
-      </w:r>
-    </w:p>
-    <w:p>
-      <w:pPr>
-        <w:keepLines/>
-        <w:spacing w:after="40"/>
-        <w:jc w:val="left"/>
-      </w:pPr>
-      <w:r>
-        <w:rPr>
-          <w:rFonts w:ascii="DejaVu Sans Mono" w:hAnsi="DejaVu Sans Mono" w:cs="DejaVu Sans"/>
+          <w:rFonts w:ascii="DejaVu Sans Mono" w:hAnsi="DejaVu Sans Mono" w:cs="DejaVu Sans Mono" w:eastAsia="DejaVu Sans Mono"/>
+          <w:color w:val="233142"/>
           <w:sz w:val="18"/>
         </w:rPr>
         <w:t>data-extractor download customer_search --date 2026-01-07 --output ./downloads</w:t>
@@ -410,103 +1182,404 @@
     </w:p>
     <w:p>
       <w:pPr>
+        <w:keepLines w:val="0"/>
+        <w:bidi w:val="1"/>
         <w:jc w:val="right"/>
-        <w:keepLines/>
-        <w:bidi w:val="1"/>
       </w:pPr>
       <w:r>
         <w:rPr>
-          <w:rFonts w:ascii="DejaVu Sans" w:hAnsi="DejaVu Sans" w:cs="DejaVu Sans"/>
-          <w:sz w:val="22"/>
+          <w:rFonts w:ascii="DejaVu Sans" w:hAnsi="DejaVu Sans" w:cs="DejaVu Sans" w:eastAsia="DejaVu Sans"/>
+          <w:b w:val="0"/>
+          <w:color w:val="000000"/>
+          <w:sz w:val="21"/>
           <w:rtl w:val="1"/>
         </w:rPr>
-        <w:t>فایل‌ها در downloads/customer_search_2026-01-07 ذخیره می‌شوند. فقط نتیجه کامل با فهرست تکمیل دریافت می‌شود؛ فایل ناقص قابل دریافت نیست. فایل موجود جایگزین نمی‌شود مگر گزینه --overwrite را آگاهانه اضافه کنید. فایل‌ها CSV فشرده با gzip هستند، سرستون دارند و متن فارسی را با UTF-8 نگه می‌دارند. مقدار تهی با نشانگر \N نوشته می‌شود؛ اگر متن واقعی همین نشانگر باشد، تفسیر مقدار تهی می‌تواند مبهم شود. برای تحلیل حساس با مدیر هماهنگ کنید. فایل را با ابزار دارای پشتیبانی gzip و CSV باز کنید.</w:t>
+        <w:t>دریافت فقط برای نتیجهٔ کامل که فهرست تکمیل معتبر دارد ممکن است. فایل CSV فشرده با gzip، دارای سرستون و با رمزگذاری UTF-8 است. نشانگر مقدار تهی از دو نویسه تشکیل شده است: نخست بک‌اسلش و سپس حرف انگلیسی N. فایل محلی موجود خودکار جایگزین نمی‌شود؛ برای نگه‌داشتن فایل قبلی، پوشهٔ دیگری انتخاب کنید.</w:t>
       </w:r>
     </w:p>
     <w:p>
       <w:pPr>
         <w:pStyle w:val="Heading1"/>
-        <w:jc w:val="right"/>
         <w:keepLines/>
         <w:bidi w:val="1"/>
+        <w:jc w:val="right"/>
       </w:pPr>
       <w:r>
         <w:rPr>
-          <w:rFonts w:ascii="DejaVu Sans" w:hAnsi="DejaVu Sans" w:cs="DejaVu Sans"/>
-          <w:sz w:val="28"/>
+          <w:rFonts w:ascii="DejaVu Sans" w:hAnsi="DejaVu Sans" w:cs="DejaVu Sans" w:eastAsia="DejaVu Sans"/>
+          <w:b/>
+          <w:color w:val="000000"/>
+          <w:sz w:val="30"/>
           <w:rtl w:val="1"/>
         </w:rPr>
-        <w:t>خطاهای رایج و رفع مشکل</w:t>
+        <w:t>۵. اگر خطا دیدید</w:t>
       </w:r>
+    </w:p>
+    <w:tbl>
+      <w:tblPr>
+        <w:tblStyle w:val="LightShading-Accent1"/>
+        <w:tblW w:type="auto" w:w="0"/>
+        <w:tblLayout w:type="autofit"/>
+        <w:tblLook w:firstColumn="1" w:firstRow="1" w:lastColumn="0" w:lastRow="0" w:noHBand="0" w:noVBand="1" w:val="04A0"/>
+      </w:tblPr>
+      <w:tblGrid>
+        <w:gridCol w:w="5227"/>
+        <w:gridCol w:w="5227"/>
+      </w:tblGrid>
+      <w:tr>
+        <w:tc>
+          <w:tcPr>
+            <w:tcW w:type="dxa" w:w="5227"/>
+            <w:vAlign w:val="center"/>
+            <w:textDirection w:val="rlTb"/>
+            <w:shd w:fill="DCEAF2"/>
+          </w:tcPr>
+          <w:p>
+            <w:pPr>
+              <w:bidi w:val="1"/>
+              <w:spacing w:after="60"/>
+              <w:jc w:val="right"/>
+            </w:pPr>
+            <w:r>
+              <w:rPr>
+                <w:rFonts w:ascii="DejaVu Sans" w:hAnsi="DejaVu Sans" w:cs="DejaVu Sans" w:eastAsia="DejaVu Sans"/>
+                <w:b/>
+                <w:color w:val="16354A"/>
+                <w:sz w:val="20"/>
+                <w:rtl w:val="1"/>
+              </w:rPr>
+              <w:t>پیام یا وضعیت</w:t>
+            </w:r>
+          </w:p>
+        </w:tc>
+        <w:tc>
+          <w:tcPr>
+            <w:tcW w:type="dxa" w:w="5227"/>
+            <w:vAlign w:val="center"/>
+            <w:textDirection w:val="rlTb"/>
+            <w:shd w:fill="DCEAF2"/>
+          </w:tcPr>
+          <w:p>
+            <w:pPr>
+              <w:bidi w:val="1"/>
+              <w:spacing w:after="60"/>
+              <w:jc w:val="right"/>
+            </w:pPr>
+            <w:r>
+              <w:rPr>
+                <w:rFonts w:ascii="DejaVu Sans" w:hAnsi="DejaVu Sans" w:cs="DejaVu Sans" w:eastAsia="DejaVu Sans"/>
+                <w:b/>
+                <w:color w:val="16354A"/>
+                <w:sz w:val="20"/>
+                <w:rtl w:val="1"/>
+              </w:rPr>
+              <w:t>چه کار کنید</w:t>
+            </w:r>
+          </w:p>
+        </w:tc>
+      </w:tr>
+      <w:tr>
+        <w:tc>
+          <w:tcPr>
+            <w:tcW w:type="dxa" w:w="5227"/>
+            <w:vAlign w:val="center"/>
+            <w:textDirection w:val="rlTb"/>
+          </w:tcPr>
+          <w:p>
+            <w:pPr>
+              <w:bidi w:val="1"/>
+              <w:spacing w:after="60"/>
+              <w:jc w:val="right"/>
+            </w:pPr>
+            <w:r>
+              <w:rPr>
+                <w:rFonts w:ascii="DejaVu Sans" w:hAnsi="DejaVu Sans" w:cs="DejaVu Sans" w:eastAsia="DejaVu Sans"/>
+                <w:b w:val="0"/>
+                <w:color w:val="16354A"/>
+                <w:sz w:val="20"/>
+                <w:rtl w:val="1"/>
+              </w:rPr>
+              <w:t>تاریخ نامعتبر یا روز داده موجود نیست</w:t>
+            </w:r>
+          </w:p>
+        </w:tc>
+        <w:tc>
+          <w:tcPr>
+            <w:tcW w:type="dxa" w:w="5227"/>
+            <w:vAlign w:val="center"/>
+            <w:textDirection w:val="rlTb"/>
+          </w:tcPr>
+          <w:p>
+            <w:pPr>
+              <w:bidi w:val="1"/>
+              <w:spacing w:after="60"/>
+              <w:jc w:val="right"/>
+            </w:pPr>
+            <w:r>
+              <w:rPr>
+                <w:rFonts w:ascii="DejaVu Sans" w:hAnsi="DejaVu Sans" w:cs="DejaVu Sans" w:eastAsia="DejaVu Sans"/>
+                <w:b w:val="0"/>
+                <w:color w:val="16354A"/>
+                <w:sz w:val="20"/>
+                <w:rtl w:val="1"/>
+              </w:rPr>
+              <w:t>قالب را بررسی کنید؛ بازه حداکثر هفت روز و همهٔ روزها باید دارای داده باشند.</w:t>
+            </w:r>
+          </w:p>
+        </w:tc>
+      </w:tr>
+      <w:tr>
+        <w:tc>
+          <w:tcPr>
+            <w:tcW w:type="dxa" w:w="5227"/>
+            <w:vAlign w:val="center"/>
+            <w:textDirection w:val="rlTb"/>
+          </w:tcPr>
+          <w:p>
+            <w:pPr>
+              <w:bidi w:val="1"/>
+              <w:spacing w:after="60"/>
+              <w:jc w:val="right"/>
+            </w:pPr>
+            <w:r>
+              <w:rPr>
+                <w:rFonts w:ascii="DejaVu Sans" w:hAnsi="DejaVu Sans" w:cs="DejaVu Sans" w:eastAsia="DejaVu Sans"/>
+                <w:b w:val="0"/>
+                <w:color w:val="16354A"/>
+                <w:sz w:val="20"/>
+                <w:rtl w:val="1"/>
+              </w:rPr>
+              <w:t>نام ستون یا شرط نامعتبر</w:t>
+            </w:r>
+          </w:p>
+        </w:tc>
+        <w:tc>
+          <w:tcPr>
+            <w:tcW w:type="dxa" w:w="5227"/>
+            <w:vAlign w:val="center"/>
+            <w:textDirection w:val="rlTb"/>
+          </w:tcPr>
+          <w:p>
+            <w:pPr>
+              <w:bidi w:val="1"/>
+              <w:spacing w:after="60"/>
+              <w:jc w:val="right"/>
+            </w:pPr>
+            <w:r>
+              <w:rPr>
+                <w:rFonts w:ascii="DejaVu Sans" w:hAnsi="DejaVu Sans" w:cs="DejaVu Sans" w:eastAsia="DejaVu Sans"/>
+                <w:b w:val="0"/>
+                <w:color w:val="16354A"/>
+                <w:sz w:val="20"/>
+                <w:rtl w:val="1"/>
+              </w:rPr>
+              <w:t>نام و نوع ستون مرحلهٔ ۲ را با شرط خود هماهنگ کنید.</w:t>
+            </w:r>
+          </w:p>
+        </w:tc>
+      </w:tr>
+      <w:tr>
+        <w:tc>
+          <w:tcPr>
+            <w:tcW w:type="dxa" w:w="5227"/>
+            <w:vAlign w:val="center"/>
+            <w:textDirection w:val="rlTb"/>
+          </w:tcPr>
+          <w:p>
+            <w:pPr>
+              <w:bidi w:val="1"/>
+              <w:spacing w:after="60"/>
+              <w:jc w:val="right"/>
+            </w:pPr>
+            <w:r>
+              <w:rPr>
+                <w:rFonts w:ascii="DejaVu Sans" w:hAnsi="DejaVu Sans" w:cs="DejaVu Sans" w:eastAsia="DejaVu Sans"/>
+                <w:b w:val="0"/>
+                <w:color w:val="16354A"/>
+                <w:sz w:val="20"/>
+                <w:rtl w:val="1"/>
+              </w:rPr>
+              <w:t>نام جست‌وجو یا مسیر تکراری است</w:t>
+            </w:r>
+          </w:p>
+        </w:tc>
+        <w:tc>
+          <w:tcPr>
+            <w:tcW w:type="dxa" w:w="5227"/>
+            <w:vAlign w:val="center"/>
+            <w:textDirection w:val="rlTb"/>
+          </w:tcPr>
+          <w:p>
+            <w:pPr>
+              <w:bidi w:val="1"/>
+              <w:spacing w:after="60"/>
+              <w:jc w:val="right"/>
+            </w:pPr>
+            <w:r>
+              <w:rPr>
+                <w:rFonts w:ascii="DejaVu Sans" w:hAnsi="DejaVu Sans" w:cs="DejaVu Sans" w:eastAsia="DejaVu Sans"/>
+                <w:b w:val="0"/>
+                <w:color w:val="16354A"/>
+                <w:sz w:val="20"/>
+                <w:rtl w:val="1"/>
+              </w:rPr>
+              <w:t>نام تازه انتخاب کنید؛ خروجی قبلی جایگزین نمی‌شود.</w:t>
+            </w:r>
+          </w:p>
+        </w:tc>
+      </w:tr>
+      <w:tr>
+        <w:tc>
+          <w:tcPr>
+            <w:tcW w:type="dxa" w:w="5227"/>
+            <w:vAlign w:val="center"/>
+            <w:textDirection w:val="rlTb"/>
+          </w:tcPr>
+          <w:p>
+            <w:pPr>
+              <w:bidi w:val="1"/>
+              <w:spacing w:after="60"/>
+              <w:jc w:val="right"/>
+            </w:pPr>
+            <w:r>
+              <w:rPr>
+                <w:rFonts w:ascii="DejaVu Sans" w:hAnsi="DejaVu Sans" w:cs="DejaVu Sans" w:eastAsia="DejaVu Sans"/>
+                <w:b w:val="0"/>
+                <w:color w:val="16354A"/>
+                <w:sz w:val="20"/>
+                <w:rtl w:val="1"/>
+              </w:rPr>
+              <w:t>اتصال یا مهلت زمانی خطا داد</w:t>
+            </w:r>
+          </w:p>
+        </w:tc>
+        <w:tc>
+          <w:tcPr>
+            <w:tcW w:type="dxa" w:w="5227"/>
+            <w:vAlign w:val="center"/>
+            <w:textDirection w:val="rlTb"/>
+          </w:tcPr>
+          <w:p>
+            <w:pPr>
+              <w:bidi w:val="1"/>
+              <w:spacing w:after="60"/>
+              <w:jc w:val="right"/>
+            </w:pPr>
+            <w:r>
+              <w:rPr>
+                <w:rFonts w:ascii="DejaVu Sans" w:hAnsi="DejaVu Sans" w:cs="DejaVu Sans" w:eastAsia="DejaVu Sans"/>
+                <w:b w:val="0"/>
+                <w:color w:val="16354A"/>
+                <w:sz w:val="20"/>
+                <w:rtl w:val="1"/>
+              </w:rPr>
+              <w:t>شناسه و زمان خطا را به مدیر بدهید؛ نشانی را عوض نکنید یا کار را تکرار نکنید.</w:t>
+            </w:r>
+          </w:p>
+        </w:tc>
+      </w:tr>
+      <w:tr>
+        <w:tc>
+          <w:tcPr>
+            <w:tcW w:type="dxa" w:w="5227"/>
+            <w:vAlign w:val="center"/>
+            <w:textDirection w:val="rlTb"/>
+          </w:tcPr>
+          <w:p>
+            <w:pPr>
+              <w:bidi w:val="1"/>
+              <w:spacing w:after="60"/>
+              <w:jc w:val="right"/>
+            </w:pPr>
+            <w:r>
+              <w:rPr>
+                <w:rFonts w:ascii="DejaVu Sans" w:hAnsi="DejaVu Sans" w:cs="DejaVu Sans" w:eastAsia="DejaVu Sans"/>
+                <w:b w:val="0"/>
+                <w:color w:val="16354A"/>
+                <w:sz w:val="20"/>
+                <w:rtl w:val="1"/>
+              </w:rPr>
+              <w:t>فرمان دریافت خطا داد</w:t>
+            </w:r>
+          </w:p>
+        </w:tc>
+        <w:tc>
+          <w:tcPr>
+            <w:tcW w:type="dxa" w:w="5227"/>
+            <w:vAlign w:val="center"/>
+            <w:textDirection w:val="rlTb"/>
+          </w:tcPr>
+          <w:p>
+            <w:pPr>
+              <w:bidi w:val="1"/>
+              <w:spacing w:after="60"/>
+              <w:jc w:val="right"/>
+            </w:pPr>
+            <w:r>
+              <w:rPr>
+                <w:rFonts w:ascii="DejaVu Sans" w:hAnsi="DejaVu Sans" w:cs="DejaVu Sans" w:eastAsia="DejaVu Sans"/>
+                <w:b w:val="0"/>
+                <w:color w:val="16354A"/>
+                <w:sz w:val="20"/>
+                <w:rtl w:val="1"/>
+              </w:rPr>
+              <w:t>از مدیر بخواهید دسترسی دستگاه و کامل بودن نتیجه را بررسی کند.</w:t>
+            </w:r>
+          </w:p>
+        </w:tc>
+      </w:tr>
+    </w:tbl>
+    <w:p>
+      <w:pPr>
+        <w:spacing w:after="40"/>
+      </w:pPr>
     </w:p>
     <w:p>
       <w:pPr>
+        <w:keepLines w:val="0"/>
+        <w:bidi w:val="1"/>
         <w:jc w:val="right"/>
-        <w:keepLines/>
-        <w:bidi w:val="1"/>
       </w:pPr>
       <w:r>
         <w:rPr>
-          <w:rFonts w:ascii="DejaVu Sans" w:hAnsi="DejaVu Sans" w:cs="DejaVu Sans"/>
-          <w:sz w:val="22"/>
+          <w:rFonts w:ascii="DejaVu Sans" w:hAnsi="DejaVu Sans" w:cs="DejaVu Sans" w:eastAsia="DejaVu Sans"/>
+          <w:b w:val="0"/>
+          <w:color w:val="000000"/>
+          <w:sz w:val="21"/>
           <w:rtl w:val="1"/>
         </w:rPr>
-        <w:t>تاریخ نامعتبر یا بازه طولانی: قالب و ترتیب تاریخ‌ها را بررسی کنید و بازه را به حداکثر هفت روز کاهش دهید. ستون یا شرط نامعتبر: نام و نوع ستون را با فهرست مدیر تطبیق دهید. سقف یا تعداد فایل نامعتبر: عدد صحیح مثبت وارد کنید و در صورت پیشنهاد سامانه تعداد فایل را بیشتر کنید.</w:t>
-      </w:r>
-    </w:p>
-    <w:p>
-      <w:pPr>
-        <w:jc w:val="right"/>
-        <w:keepLines/>
-        <w:bidi w:val="1"/>
-      </w:pPr>
-      <w:r>
-        <w:rPr>
-          <w:rFonts w:ascii="DejaVu Sans" w:hAnsi="DejaVu Sans" w:cs="DejaVu Sans"/>
-          <w:sz w:val="22"/>
-          <w:rtl w:val="1"/>
-        </w:rPr>
-        <w:t>نام تکراری یا مسیر موجود: نام جدید انتخاب کنید؛ خروجی قبلی پاک یا جایگزین نمی‌شود. روز ورودی مفقود: تاریخ را بررسی کنید و به مدیر اطلاع دهید. خطای اتصال یا زمان انتظار: به مدیر اطلاع دهید؛ تغییر نشانی اتصال در دفترچه لازم نیست. شناسه خطا و زمان رخداد را ارسال کنید تا مدیر گزارش فنی را بررسی کند.</w:t>
-      </w:r>
-    </w:p>
-    <w:p>
-      <w:pPr>
-        <w:jc w:val="right"/>
-        <w:keepLines/>
-        <w:bidi w:val="1"/>
-      </w:pPr>
-      <w:r>
-        <w:rPr>
-          <w:rFonts w:ascii="DejaVu Sans" w:hAnsi="DejaVu Sans" w:cs="DejaVu Sans"/>
-          <w:sz w:val="22"/>
-          <w:rtl w:val="1"/>
-        </w:rPr>
-        <w:t>پس از پایان مهلت، تلاش برای توقف انجام می‌شود ولی توقف واقعی سرور قطعی نیست. ممکن است کار مسدودشده همچنان قفل اجرا را نگه دارد و جست‌وجوی بعدی رد شود. بدون بررسی مدیر، کار بزرگ را مکرراً تکرار نکنید. مدیر ممکن است راه‌اندازی دوباره هسته دفترچه را درخواست کند. خروجی ناقص به‌عنوان کامل معرفی نمی‌شود و پاک‌سازی آن وظیفه مدیر است.</w:t>
-      </w:r>
-    </w:p>
-    <w:p>
-      <w:pPr>
-        <w:jc w:val="right"/>
-        <w:keepLines/>
-        <w:bidi w:val="1"/>
-      </w:pPr>
-      <w:r>
-        <w:rPr>
-          <w:rFonts w:ascii="DejaVu Sans" w:hAnsi="DejaVu Sans" w:cs="DejaVu Sans"/>
-          <w:sz w:val="22"/>
-          <w:rtl w:val="1"/>
-        </w:rPr>
-        <w:t>خطای دریافت: دسترسی شبکه دستگاه دریافت و وجود نتیجه کامل را با مدیر بررسی کنید. برای فایل موجود، پوشه دیگری انتخاب کنید یا در صورت نیاز گزینه جایگزینی را استفاده کنید. سقف رکورد هزینه خواندن داده‌های بزرگ را محدود نمی‌کند؛ نتیجه کوچک نیز ممکن است زمان‌بر باشد. نگهداری و حذف خروجی‌ها دستی است.</w:t>
+        <w:t>پس از خطای مهلت، کار معطل ممکن است قفل دفترچه را نگه دارد و توقف سرور قطعی نیست. جست‌وجو را تکرار نکنید؛ اول با مدیر هماهنگ کنید. پاک‌سازی خروجی ناقص و نگهداری فایل‌ها با مدیر است.</w:t>
       </w:r>
     </w:p>
     <w:sectPr>
+      <w:footerReference w:type="default" r:id="rId9"/>
       <w:pgSz w:w="12240" w:h="15840"/>
-      <w:pgMar w:top="1152" w:right="1152" w:bottom="1152" w:left="1152" w:header="720" w:footer="720" w:gutter="0"/>
+      <w:pgMar w:top="893" w:right="893" w:bottom="835" w:left="893" w:header="432" w:footer="432" w:gutter="0"/>
       <w:cols w:space="720"/>
       <w:docGrid w:linePitch="360"/>
     </w:sectPr>
   </w:body>
 </w:document>
+</file>
+
+<file path=word/footer1.xml><?xml version="1.0" encoding="utf-8"?>
+<w:ftr xmlns:m="http://schemas.openxmlformats.org/officeDocument/2006/math" xmlns:mc="http://schemas.openxmlformats.org/markup-compatibility/2006" xmlns:mo="http://schemas.microsoft.com/office/mac/office/2008/main" xmlns:mv="urn:schemas-microsoft-com:mac:vml" xmlns:o="urn:schemas-microsoft-com:office:office" xmlns:r="http://schemas.openxmlformats.org/officeDocument/2006/relationships" xmlns:v="urn:schemas-microsoft-com:vml" xmlns:w10="urn:schemas-microsoft-com:office:word" xmlns:w14="http://schemas.microsoft.com/office/word/2010/wordml" xmlns:w="http://schemas.openxmlformats.org/wordprocessingml/2006/main" xmlns:wne="http://schemas.microsoft.com/office/word/2006/wordml" xmlns:wp14="http://schemas.microsoft.com/office/word/2010/wordprocessingDrawing" xmlns:wp="http://schemas.openxmlformats.org/drawingml/2006/wordprocessingDrawing" xmlns:wpc="http://schemas.microsoft.com/office/word/2010/wordprocessingCanvas" xmlns:wpg="http://schemas.microsoft.com/office/word/2010/wordprocessingGroup" xmlns:wpi="http://schemas.microsoft.com/office/word/2010/wordprocessingInk" xmlns:wps="http://schemas.microsoft.com/office/word/2010/wordprocessingShape" mc:Ignorable="w14 wp14">
+  <w:p>
+    <w:pPr>
+      <w:pStyle w:val="Footer"/>
+      <w:jc w:val="center"/>
+    </w:pPr>
+    <w:r>
+      <w:rPr>
+        <w:rFonts w:ascii="DejaVu Sans" w:hAnsi="DejaVu Sans" w:cs="DejaVu Sans" w:eastAsia="DejaVu Sans"/>
+        <w:color w:val="5A646E"/>
+        <w:sz w:val="16"/>
+        <w:rtl w:val="1"/>
+      </w:rPr>
+      <w:t>راهنمای کاربر دفترچهٔ استخراج داده</w:t>
+    </w:r>
+  </w:p>
+</w:ftr>
 </file>
 
 <file path=word/numbering.xml><?xml version="1.0" encoding="utf-8"?>
@@ -873,11 +1946,11 @@
     <w:qFormat/>
     <w:rsid w:val="00FC693F"/>
     <w:pPr>
-      <w:spacing w:after="160" w:line="283" w:lineRule="auto"/>
+      <w:spacing w:after="80" w:line="252" w:lineRule="auto"/>
     </w:pPr>
     <w:rPr>
       <w:rFonts w:ascii="DejaVu Sans" w:hAnsi="DejaVu Sans"/>
-      <w:color w:val="000000"/>
+      <w:color w:val="232B34"/>
       <w:sz w:val="22"/>
     </w:rPr>
   </w:style>
@@ -936,7 +2009,7 @@
     <w:pPr>
       <w:keepNext/>
       <w:keepLines/>
-      <w:spacing w:before="480" w:after="160" w:line="283" w:lineRule="auto"/>
+      <w:spacing w:before="220" w:after="100"/>
       <w:outlineLvl w:val="0"/>
     </w:pPr>
     <w:rPr>
@@ -944,7 +2017,7 @@
       <w:b/>
       <w:bCs/>
       <w:color w:val="000000"/>
-      <w:sz w:val="28"/>
+      <w:sz w:val="30"/>
       <w:szCs w:val="28"/>
     </w:rPr>
   </w:style>
@@ -960,7 +2033,7 @@
     <w:pPr>
       <w:keepNext/>
       <w:keepLines/>
-      <w:spacing w:before="200" w:after="160" w:line="283" w:lineRule="auto"/>
+      <w:spacing w:before="220" w:after="100"/>
       <w:outlineLvl w:val="1"/>
     </w:pPr>
     <w:rPr>
@@ -968,7 +2041,7 @@
       <w:b/>
       <w:bCs/>
       <w:color w:val="000000"/>
-      <w:sz w:val="28"/>
+      <w:sz w:val="24"/>
       <w:szCs w:val="26"/>
     </w:rPr>
   </w:style>
@@ -1222,15 +2295,20 @@
     <w:qFormat/>
     <w:rsid w:val="00FC693F"/>
     <w:pPr>
-      <w:spacing w:after="160" w:line="283" w:lineRule="auto"/>
+      <w:keepNext/>
+      <w:pBdr>
+        <w:bottom w:val="single" w:sz="8" w:space="4" w:color="4F81BD" w:themeColor="accent1"/>
+      </w:pBdr>
+      <w:spacing w:after="100" w:line="240" w:lineRule="auto" w:before="0"/>
       <w:contextualSpacing/>
     </w:pPr>
     <w:rPr>
       <w:rFonts w:asciiTheme="majorHAnsi" w:eastAsiaTheme="majorEastAsia" w:hAnsiTheme="majorHAnsi" w:cstheme="majorBidi" w:ascii="DejaVu Sans" w:hAnsi="DejaVu Sans"/>
+      <w:b/>
       <w:color w:val="000000"/>
       <w:spacing w:val="5"/>
       <w:kern w:val="28"/>
-      <w:sz w:val="38"/>
+      <w:sz w:val="42"/>
       <w:szCs w:val="52"/>
     </w:rPr>
   </w:style>
@@ -1706,6 +2784,9 @@
     <w:qFormat/>
     <w:rsid w:val="00FC693F"/>
     <w:pPr>
+      <w:pBdr>
+        <w:bottom w:val="single" w:sz="4" w:space="4" w:color="4F81BD" w:themeColor="accent1"/>
+      </w:pBdr>
       <w:spacing w:before="200" w:after="280"/>
       <w:ind w:left="936" w:right="936"/>
     </w:pPr>

</xml_diff>

<commit_message>
Support direct ZIP checkout usage in Jupyter
</commit_message>
<xml_diff>
--- a/docs/customer_guide_fa.docx
+++ b/docs/customer_guide_fa.docx
@@ -69,7 +69,61 @@
           <w:sz w:val="21"/>
           <w:rtl w:val="1"/>
         </w:rPr>
-        <w:t xml:space="preserve">دفترچهٔ </w:t>
+        <w:t xml:space="preserve">فایل ZIP پروژه را بارگذاری و در یک پوشه استخراج کنید؛ پوشه باید شامل </w:t>
+      </w:r>
+      <w:r>
+        <w:rPr>
+          <w:rFonts w:ascii="DejaVu Sans Mono" w:hAnsi="DejaVu Sans Mono" w:cs="DejaVu Sans Mono" w:eastAsia="DejaVu Sans Mono"/>
+          <w:color w:val="233142"/>
+          <w:sz w:val="19"/>
+        </w:rPr>
+        <w:t>data_extractor/</w:t>
+      </w:r>
+      <w:r>
+        <w:rPr>
+          <w:rFonts w:ascii="DejaVu Sans" w:hAnsi="DejaVu Sans" w:cs="DejaVu Sans" w:eastAsia="DejaVu Sans"/>
+          <w:b w:val="0"/>
+          <w:color w:val="000000"/>
+          <w:sz w:val="21"/>
+          <w:rtl w:val="1"/>
+        </w:rPr>
+        <w:t xml:space="preserve"> و فایل ریشهٔ </w:t>
+      </w:r>
+      <w:r>
+        <w:rPr>
+          <w:rFonts w:ascii="DejaVu Sans Mono" w:hAnsi="DejaVu Sans Mono" w:cs="DejaVu Sans Mono" w:eastAsia="DejaVu Sans Mono"/>
+          <w:color w:val="233142"/>
+          <w:sz w:val="19"/>
+        </w:rPr>
+        <w:t>customer_example.ipynb</w:t>
+      </w:r>
+      <w:r>
+        <w:rPr>
+          <w:rFonts w:ascii="DejaVu Sans" w:hAnsi="DejaVu Sans" w:cs="DejaVu Sans" w:eastAsia="DejaVu Sans"/>
+          <w:b w:val="0"/>
+          <w:color w:val="000000"/>
+          <w:sz w:val="21"/>
+          <w:rtl w:val="1"/>
+        </w:rPr>
+        <w:t xml:space="preserve"> باشد. Jupyter را از ریشهٔ همین پوشه اجرا کنید تا بسته مستقیماً وارد شود. در اجرای مستقیم از پوشهٔ استخراج‌شده، بسته بدون نصب editable وارد می‌شود. فایل </w:t>
+      </w:r>
+      <w:r>
+        <w:rPr>
+          <w:rFonts w:ascii="DejaVu Sans Mono" w:hAnsi="DejaVu Sans Mono" w:cs="DejaVu Sans Mono" w:eastAsia="DejaVu Sans Mono"/>
+          <w:color w:val="233142"/>
+          <w:sz w:val="19"/>
+        </w:rPr>
+        <w:t>admin.yaml</w:t>
+      </w:r>
+      <w:r>
+        <w:rPr>
+          <w:rFonts w:ascii="DejaVu Sans" w:hAnsi="DejaVu Sans" w:cs="DejaVu Sans" w:eastAsia="DejaVu Sans"/>
+          <w:b w:val="0"/>
+          <w:color w:val="000000"/>
+          <w:sz w:val="21"/>
+          <w:rtl w:val="1"/>
+        </w:rPr>
+        <w:t xml:space="preserve"> ریشه فقط نمونهٔ خالی است و باید مدیر سامانه آن را تنظیم کند؛ برای محیط واقعی، پیکربندی بیرونی و محافظت‌شده ترجیح دارد. کاربر دفترچه نباید نشانی یا رمز را تغییر دهد. سپس دفترچهٔ </w:t>
       </w:r>
       <w:r>
         <w:rPr>
@@ -2296,9 +2350,6 @@
     <w:rsid w:val="00FC693F"/>
     <w:pPr>
       <w:keepNext/>
-      <w:pBdr>
-        <w:bottom w:val="single" w:sz="8" w:space="4" w:color="4F81BD" w:themeColor="accent1"/>
-      </w:pBdr>
       <w:spacing w:after="100" w:line="240" w:lineRule="auto" w:before="0"/>
       <w:contextualSpacing/>
     </w:pPr>

</xml_diff>